<commit_message>
Week 2: Updated progress report with unit test results
</commit_message>
<xml_diff>
--- a/weekly_progress/week2/Week2_Progress_Report.docx
+++ b/weekly_progress/week2/Week2_Progress_Report.docx
@@ -35,7 +35,7 @@
           <w:sz w:val="24"/>
           <w:szCs w:val="24"/>
         </w:rPr>
-        <w:t xml:space="preserve">Week 2  |  22 – 24 June 2026</w:t>
+        <w:t xml:space="preserve">Week 2  |  22 – 25 June 2026  |  UPDATED</w:t>
       </w:r>
     </w:p>
     <w:p>
@@ -67,7 +67,7 @@
           <w:sz w:val="20"/>
           <w:szCs w:val="20"/>
         </w:rPr>
-        <w:t xml:space="preserve">This document is the Week 2 progress report for the MoodCine Final Year Project. It covers all tasks completed during this week including system architecture design, TMDB API integration, and PostgreSQL database setup.</w:t>
+        <w:t xml:space="preserve">This is the updated Week 2 progress report including unit testing results completed on 25 June 2026. All 18 unit tests passed successfully across database, NLP, and TMDB modules.</w:t>
       </w:r>
     </w:p>
     <w:p>
@@ -403,7 +403,7 @@
                 <w:sz w:val="18"/>
                 <w:szCs w:val="18"/>
               </w:rPr>
-              <w:t xml:space="preserve">Report Week</w:t>
+              <w:t xml:space="preserve">Module</w:t>
             </w:r>
           </w:p>
         </w:tc>
@@ -434,7 +434,7 @@
                 <w:sz w:val="18"/>
                 <w:szCs w:val="18"/>
               </w:rPr>
-              <w:t xml:space="preserve">Week 2 — 22 to 24 June 2026</w:t>
+              <w:t xml:space="preserve">7COM1040 — Computer Science Masters Project</w:t>
             </w:r>
           </w:p>
         </w:tc>
@@ -467,7 +467,7 @@
                 <w:sz w:val="18"/>
                 <w:szCs w:val="18"/>
               </w:rPr>
-              <w:t xml:space="preserve">Interim Deadline</w:t>
+              <w:t xml:space="preserve">Project Title</w:t>
             </w:r>
           </w:p>
         </w:tc>
@@ -498,7 +498,7 @@
                 <w:sz w:val="18"/>
                 <w:szCs w:val="18"/>
               </w:rPr>
-              <w:t xml:space="preserve">20 July 2026  (26 days remaining)</w:t>
+              <w:t xml:space="preserve">MoodCine: A Multi-Modal Emotion-Aware Movie Recommendation System</w:t>
             </w:r>
           </w:p>
         </w:tc>
@@ -531,6 +531,134 @@
                 <w:sz w:val="18"/>
                 <w:szCs w:val="18"/>
               </w:rPr>
+              <w:t xml:space="preserve">Report Week</w:t>
+            </w:r>
+          </w:p>
+        </w:tc>
+        <w:tc>
+          <w:tcPr>
+            <w:tcW w:type="dxa" w:w="6626"/>
+            <w:tcBorders>
+              <w:top w:val="single" w:color="CCCCCC" w:sz="1"/>
+              <w:left w:val="single" w:color="CCCCCC" w:sz="1"/>
+              <w:bottom w:val="single" w:color="CCCCCC" w:sz="1"/>
+              <w:right w:val="single" w:color="CCCCCC" w:sz="1"/>
+            </w:tcBorders>
+            <w:shd w:fill="FFFFFF" w:val="clear"/>
+            <w:tcMar>
+              <w:top w:type="dxa" w:w="80"/>
+              <w:left w:type="dxa" w:w="120"/>
+              <w:bottom w:type="dxa" w:w="80"/>
+              <w:right w:type="dxa" w:w="120"/>
+            </w:tcMar>
+          </w:tcPr>
+          <w:p>
+            <w:r>
+              <w:rPr>
+                <w:rFonts w:ascii="Arial" w:cs="Arial" w:eastAsia="Arial" w:hAnsi="Arial"/>
+                <w:b w:val="false"/>
+                <w:bCs w:val="false"/>
+                <w:color w:val="000000"/>
+                <w:sz w:val="18"/>
+                <w:szCs w:val="18"/>
+              </w:rPr>
+              <w:t xml:space="preserve">Week 2 — 22 to 25 June 2026</w:t>
+            </w:r>
+          </w:p>
+        </w:tc>
+      </w:tr>
+      <w:tr>
+        <w:tc>
+          <w:tcPr>
+            <w:tcW w:type="dxa" w:w="2400"/>
+            <w:tcBorders>
+              <w:top w:val="single" w:color="CCCCCC" w:sz="1"/>
+              <w:left w:val="single" w:color="CCCCCC" w:sz="1"/>
+              <w:bottom w:val="single" w:color="CCCCCC" w:sz="1"/>
+              <w:right w:val="single" w:color="CCCCCC" w:sz="1"/>
+            </w:tcBorders>
+            <w:shd w:fill="F2F2F2" w:val="clear"/>
+            <w:tcMar>
+              <w:top w:type="dxa" w:w="80"/>
+              <w:left w:type="dxa" w:w="120"/>
+              <w:bottom w:type="dxa" w:w="80"/>
+              <w:right w:type="dxa" w:w="120"/>
+            </w:tcMar>
+          </w:tcPr>
+          <w:p>
+            <w:r>
+              <w:rPr>
+                <w:rFonts w:ascii="Arial" w:cs="Arial" w:eastAsia="Arial" w:hAnsi="Arial"/>
+                <w:b/>
+                <w:bCs/>
+                <w:color w:val="000000"/>
+                <w:sz w:val="18"/>
+                <w:szCs w:val="18"/>
+              </w:rPr>
+              <w:t xml:space="preserve">Interim Deadline</w:t>
+            </w:r>
+          </w:p>
+        </w:tc>
+        <w:tc>
+          <w:tcPr>
+            <w:tcW w:type="dxa" w:w="6626"/>
+            <w:tcBorders>
+              <w:top w:val="single" w:color="CCCCCC" w:sz="1"/>
+              <w:left w:val="single" w:color="CCCCCC" w:sz="1"/>
+              <w:bottom w:val="single" w:color="CCCCCC" w:sz="1"/>
+              <w:right w:val="single" w:color="CCCCCC" w:sz="1"/>
+            </w:tcBorders>
+            <w:shd w:fill="FFFFFF" w:val="clear"/>
+            <w:tcMar>
+              <w:top w:type="dxa" w:w="80"/>
+              <w:left w:type="dxa" w:w="120"/>
+              <w:bottom w:type="dxa" w:w="80"/>
+              <w:right w:type="dxa" w:w="120"/>
+            </w:tcMar>
+          </w:tcPr>
+          <w:p>
+            <w:r>
+              <w:rPr>
+                <w:rFonts w:ascii="Arial" w:cs="Arial" w:eastAsia="Arial" w:hAnsi="Arial"/>
+                <w:b w:val="false"/>
+                <w:bCs w:val="false"/>
+                <w:color w:val="000000"/>
+                <w:sz w:val="18"/>
+                <w:szCs w:val="18"/>
+              </w:rPr>
+              <w:t xml:space="preserve">20 July 2026  (25 days remaining)</w:t>
+            </w:r>
+          </w:p>
+        </w:tc>
+      </w:tr>
+      <w:tr>
+        <w:tc>
+          <w:tcPr>
+            <w:tcW w:type="dxa" w:w="2400"/>
+            <w:tcBorders>
+              <w:top w:val="single" w:color="CCCCCC" w:sz="1"/>
+              <w:left w:val="single" w:color="CCCCCC" w:sz="1"/>
+              <w:bottom w:val="single" w:color="CCCCCC" w:sz="1"/>
+              <w:right w:val="single" w:color="CCCCCC" w:sz="1"/>
+            </w:tcBorders>
+            <w:shd w:fill="F2F2F2" w:val="clear"/>
+            <w:tcMar>
+              <w:top w:type="dxa" w:w="80"/>
+              <w:left w:type="dxa" w:w="120"/>
+              <w:bottom w:type="dxa" w:w="80"/>
+              <w:right w:type="dxa" w:w="120"/>
+            </w:tcMar>
+          </w:tcPr>
+          <w:p>
+            <w:r>
+              <w:rPr>
+                <w:rFonts w:ascii="Arial" w:cs="Arial" w:eastAsia="Arial" w:hAnsi="Arial"/>
+                <w:b/>
+                <w:bCs/>
+                <w:color w:val="000000"/>
+                <w:sz w:val="18"/>
+                <w:szCs w:val="18"/>
+              </w:rPr>
               <w:t xml:space="preserve">Final Deadline</w:t>
             </w:r>
           </w:p>
@@ -562,7 +690,7 @@
                 <w:sz w:val="18"/>
                 <w:szCs w:val="18"/>
               </w:rPr>
-              <w:t xml:space="preserve">1 September 2026  (69 days remaining)</w:t>
+              <w:t xml:space="preserve">1 September 2026  (68 days remaining)</w:t>
             </w:r>
           </w:p>
         </w:tc>
@@ -592,7 +720,7 @@
           <w:sz w:val="26"/>
           <w:szCs w:val="26"/>
         </w:rPr>
-        <w:t xml:space="preserve">2. Completed Tasks — Week 2</w:t>
+        <w:t xml:space="preserve">2. Completed Tasks — Week 2 (All 12 Tasks)</w:t>
       </w:r>
     </w:p>
     <w:tbl>
@@ -609,9 +737,9 @@
       </w:tblPr>
       <w:tblGrid>
         <w:gridCol w:w="400"/>
-        <w:gridCol w:w="3800"/>
+        <w:gridCol w:w="3600"/>
         <w:gridCol w:w="2800"/>
-        <w:gridCol w:w="2026"/>
+        <w:gridCol w:w="2226"/>
       </w:tblGrid>
       <w:tr>
         <w:tc>
@@ -650,7 +778,7 @@
         </w:tc>
         <w:tc>
           <w:tcPr>
-            <w:tcW w:type="dxa" w:w="3800"/>
+            <w:tcW w:type="dxa" w:w="3600"/>
             <w:tcBorders>
               <w:top w:val="single" w:color="CCCCCC" w:sz="1"/>
               <w:left w:val="single" w:color="CCCCCC" w:sz="1"/>
@@ -718,7 +846,7 @@
         </w:tc>
         <w:tc>
           <w:tcPr>
-            <w:tcW w:type="dxa" w:w="2026"/>
+            <w:tcW w:type="dxa" w:w="2226"/>
             <w:tcBorders>
               <w:top w:val="single" w:color="CCCCCC" w:sz="1"/>
               <w:left w:val="single" w:color="CCCCCC" w:sz="1"/>
@@ -785,7 +913,7 @@
         </w:tc>
         <w:tc>
           <w:tcPr>
-            <w:tcW w:type="dxa" w:w="3800"/>
+            <w:tcW w:type="dxa" w:w="3600"/>
             <w:tcBorders>
               <w:top w:val="single" w:color="CCCCCC" w:sz="1"/>
               <w:left w:val="single" w:color="CCCCCC" w:sz="1"/>
@@ -847,7 +975,7 @@
         </w:tc>
         <w:tc>
           <w:tcPr>
-            <w:tcW w:type="dxa" w:w="2026"/>
+            <w:tcW w:type="dxa" w:w="2226"/>
             <w:tcBorders>
               <w:top w:val="single" w:color="CCCCCC" w:sz="1"/>
               <w:left w:val="single" w:color="CCCCCC" w:sz="1"/>
@@ -911,32 +1039,32 @@
         </w:tc>
         <w:tc>
           <w:tcPr>
-            <w:tcW w:type="dxa" w:w="3800"/>
-            <w:tcBorders>
-              <w:top w:val="single" w:color="CCCCCC" w:sz="1"/>
-              <w:left w:val="single" w:color="CCCCCC" w:sz="1"/>
-              <w:bottom w:val="single" w:color="CCCCCC" w:sz="1"/>
-              <w:right w:val="single" w:color="CCCCCC" w:sz="1"/>
-            </w:tcBorders>
-            <w:shd w:fill="FFFFFF" w:val="clear"/>
-            <w:tcMar>
-              <w:top w:type="dxa" w:w="80"/>
-              <w:left w:type="dxa" w:w="120"/>
-              <w:bottom w:type="dxa" w:w="80"/>
-              <w:right w:type="dxa" w:w="120"/>
-            </w:tcMar>
-          </w:tcPr>
-          <w:p>
-            <w:r>
-              <w:rPr>
-                <w:rFonts w:ascii="Arial" w:cs="Arial" w:eastAsia="Arial" w:hAnsi="Arial"/>
-                <w:b w:val="false"/>
-                <w:bCs w:val="false"/>
-                <w:color w:val="000000"/>
-                <w:sz w:val="18"/>
-                <w:szCs w:val="18"/>
-              </w:rPr>
-              <w:t xml:space="preserve">Architecture + ERD Word document</w:t>
+            <w:tcW w:type="dxa" w:w="3600"/>
+            <w:tcBorders>
+              <w:top w:val="single" w:color="CCCCCC" w:sz="1"/>
+              <w:left w:val="single" w:color="CCCCCC" w:sz="1"/>
+              <w:bottom w:val="single" w:color="CCCCCC" w:sz="1"/>
+              <w:right w:val="single" w:color="CCCCCC" w:sz="1"/>
+            </w:tcBorders>
+            <w:shd w:fill="FFFFFF" w:val="clear"/>
+            <w:tcMar>
+              <w:top w:type="dxa" w:w="80"/>
+              <w:left w:type="dxa" w:w="120"/>
+              <w:bottom w:type="dxa" w:w="80"/>
+              <w:right w:type="dxa" w:w="120"/>
+            </w:tcMar>
+          </w:tcPr>
+          <w:p>
+            <w:r>
+              <w:rPr>
+                <w:rFonts w:ascii="Arial" w:cs="Arial" w:eastAsia="Arial" w:hAnsi="Arial"/>
+                <w:b w:val="false"/>
+                <w:bCs w:val="false"/>
+                <w:color w:val="000000"/>
+                <w:sz w:val="18"/>
+                <w:szCs w:val="18"/>
+              </w:rPr>
+              <w:t xml:space="preserve">ERD diagram (6 tables with PK/FK)</w:t>
             </w:r>
           </w:p>
         </w:tc>
@@ -967,13 +1095,13 @@
                 <w:sz w:val="18"/>
                 <w:szCs w:val="18"/>
               </w:rPr>
-              <w:t xml:space="preserve">Figure 1 + Figure 2 in document</w:t>
-            </w:r>
-          </w:p>
-        </w:tc>
-        <w:tc>
-          <w:tcPr>
-            <w:tcW w:type="dxa" w:w="2026"/>
+              <w:t xml:space="preserve">week2_erd_diagram.png</w:t>
+            </w:r>
+          </w:p>
+        </w:tc>
+        <w:tc>
+          <w:tcPr>
+            <w:tcW w:type="dxa" w:w="2226"/>
             <w:tcBorders>
               <w:top w:val="single" w:color="CCCCCC" w:sz="1"/>
               <w:left w:val="single" w:color="CCCCCC" w:sz="1"/>
@@ -1037,32 +1165,32 @@
         </w:tc>
         <w:tc>
           <w:tcPr>
-            <w:tcW w:type="dxa" w:w="3800"/>
-            <w:tcBorders>
-              <w:top w:val="single" w:color="CCCCCC" w:sz="1"/>
-              <w:left w:val="single" w:color="CCCCCC" w:sz="1"/>
-              <w:bottom w:val="single" w:color="CCCCCC" w:sz="1"/>
-              <w:right w:val="single" w:color="CCCCCC" w:sz="1"/>
-            </w:tcBorders>
-            <w:shd w:fill="FFFFFF" w:val="clear"/>
-            <w:tcMar>
-              <w:top w:type="dxa" w:w="80"/>
-              <w:left w:type="dxa" w:w="120"/>
-              <w:bottom w:type="dxa" w:w="80"/>
-              <w:right w:type="dxa" w:w="120"/>
-            </w:tcMar>
-          </w:tcPr>
-          <w:p>
-            <w:r>
-              <w:rPr>
-                <w:rFonts w:ascii="Arial" w:cs="Arial" w:eastAsia="Arial" w:hAnsi="Arial"/>
-                <w:b w:val="false"/>
-                <w:bCs w:val="false"/>
-                <w:color w:val="000000"/>
-                <w:sz w:val="18"/>
-                <w:szCs w:val="18"/>
-              </w:rPr>
-              <w:t xml:space="preserve">TMDB API account + API key obtained</w:t>
+            <w:tcW w:type="dxa" w:w="3600"/>
+            <w:tcBorders>
+              <w:top w:val="single" w:color="CCCCCC" w:sz="1"/>
+              <w:left w:val="single" w:color="CCCCCC" w:sz="1"/>
+              <w:bottom w:val="single" w:color="CCCCCC" w:sz="1"/>
+              <w:right w:val="single" w:color="CCCCCC" w:sz="1"/>
+            </w:tcBorders>
+            <w:shd w:fill="FFFFFF" w:val="clear"/>
+            <w:tcMar>
+              <w:top w:type="dxa" w:w="80"/>
+              <w:left w:type="dxa" w:w="120"/>
+              <w:bottom w:type="dxa" w:w="80"/>
+              <w:right w:type="dxa" w:w="120"/>
+            </w:tcMar>
+          </w:tcPr>
+          <w:p>
+            <w:r>
+              <w:rPr>
+                <w:rFonts w:ascii="Arial" w:cs="Arial" w:eastAsia="Arial" w:hAnsi="Arial"/>
+                <w:b w:val="false"/>
+                <w:bCs w:val="false"/>
+                <w:color w:val="000000"/>
+                <w:sz w:val="18"/>
+                <w:szCs w:val="18"/>
+              </w:rPr>
+              <w:t xml:space="preserve">Combined architecture + ERD Word doc</w:t>
             </w:r>
           </w:p>
         </w:tc>
@@ -1093,13 +1221,13 @@
                 <w:sz w:val="18"/>
                 <w:szCs w:val="18"/>
               </w:rPr>
-              <w:t xml:space="preserve">.env file with API key secured</w:t>
-            </w:r>
-          </w:p>
-        </w:tc>
-        <w:tc>
-          <w:tcPr>
-            <w:tcW w:type="dxa" w:w="2026"/>
+              <w:t xml:space="preserve">docs/Week2_Architecture_and_ERD.docx</w:t>
+            </w:r>
+          </w:p>
+        </w:tc>
+        <w:tc>
+          <w:tcPr>
+            <w:tcW w:type="dxa" w:w="2226"/>
             <w:tcBorders>
               <w:top w:val="single" w:color="CCCCCC" w:sz="1"/>
               <w:left w:val="single" w:color="CCCCCC" w:sz="1"/>
@@ -1163,32 +1291,32 @@
         </w:tc>
         <w:tc>
           <w:tcPr>
-            <w:tcW w:type="dxa" w:w="3800"/>
-            <w:tcBorders>
-              <w:top w:val="single" w:color="CCCCCC" w:sz="1"/>
-              <w:left w:val="single" w:color="CCCCCC" w:sz="1"/>
-              <w:bottom w:val="single" w:color="CCCCCC" w:sz="1"/>
-              <w:right w:val="single" w:color="CCCCCC" w:sz="1"/>
-            </w:tcBorders>
-            <w:shd w:fill="FFFFFF" w:val="clear"/>
-            <w:tcMar>
-              <w:top w:type="dxa" w:w="80"/>
-              <w:left w:type="dxa" w:w="120"/>
-              <w:bottom w:type="dxa" w:w="80"/>
-              <w:right w:type="dxa" w:w="120"/>
-            </w:tcMar>
-          </w:tcPr>
-          <w:p>
-            <w:r>
-              <w:rPr>
-                <w:rFonts w:ascii="Arial" w:cs="Arial" w:eastAsia="Arial" w:hAnsi="Arial"/>
-                <w:b w:val="false"/>
-                <w:bCs w:val="false"/>
-                <w:color w:val="000000"/>
-                <w:sz w:val="18"/>
-                <w:szCs w:val="18"/>
-              </w:rPr>
-              <w:t xml:space="preserve">.gitignore created — API key protected</w:t>
+            <w:tcW w:type="dxa" w:w="3600"/>
+            <w:tcBorders>
+              <w:top w:val="single" w:color="CCCCCC" w:sz="1"/>
+              <w:left w:val="single" w:color="CCCCCC" w:sz="1"/>
+              <w:bottom w:val="single" w:color="CCCCCC" w:sz="1"/>
+              <w:right w:val="single" w:color="CCCCCC" w:sz="1"/>
+            </w:tcBorders>
+            <w:shd w:fill="FFFFFF" w:val="clear"/>
+            <w:tcMar>
+              <w:top w:type="dxa" w:w="80"/>
+              <w:left w:type="dxa" w:w="120"/>
+              <w:bottom w:type="dxa" w:w="80"/>
+              <w:right w:type="dxa" w:w="120"/>
+            </w:tcMar>
+          </w:tcPr>
+          <w:p>
+            <w:r>
+              <w:rPr>
+                <w:rFonts w:ascii="Arial" w:cs="Arial" w:eastAsia="Arial" w:hAnsi="Arial"/>
+                <w:b w:val="false"/>
+                <w:bCs w:val="false"/>
+                <w:color w:val="000000"/>
+                <w:sz w:val="18"/>
+                <w:szCs w:val="18"/>
+              </w:rPr>
+              <w:t xml:space="preserve">TMDB API account + key obtained</w:t>
             </w:r>
           </w:p>
         </w:tc>
@@ -1219,13 +1347,13 @@
                 <w:sz w:val="18"/>
                 <w:szCs w:val="18"/>
               </w:rPr>
-              <w:t xml:space="preserve">.gitignore committed to GitHub</w:t>
-            </w:r>
-          </w:p>
-        </w:tc>
-        <w:tc>
-          <w:tcPr>
-            <w:tcW w:type="dxa" w:w="2026"/>
+              <w:t xml:space="preserve">.env file secured</w:t>
+            </w:r>
+          </w:p>
+        </w:tc>
+        <w:tc>
+          <w:tcPr>
+            <w:tcW w:type="dxa" w:w="2226"/>
             <w:tcBorders>
               <w:top w:val="single" w:color="CCCCCC" w:sz="1"/>
               <w:left w:val="single" w:color="CCCCCC" w:sz="1"/>
@@ -1289,32 +1417,32 @@
         </w:tc>
         <w:tc>
           <w:tcPr>
-            <w:tcW w:type="dxa" w:w="3800"/>
-            <w:tcBorders>
-              <w:top w:val="single" w:color="CCCCCC" w:sz="1"/>
-              <w:left w:val="single" w:color="CCCCCC" w:sz="1"/>
-              <w:bottom w:val="single" w:color="CCCCCC" w:sz="1"/>
-              <w:right w:val="single" w:color="CCCCCC" w:sz="1"/>
-            </w:tcBorders>
-            <w:shd w:fill="FFFFFF" w:val="clear"/>
-            <w:tcMar>
-              <w:top w:type="dxa" w:w="80"/>
-              <w:left w:type="dxa" w:w="120"/>
-              <w:bottom w:type="dxa" w:w="80"/>
-              <w:right w:type="dxa" w:w="120"/>
-            </w:tcMar>
-          </w:tcPr>
-          <w:p>
-            <w:r>
-              <w:rPr>
-                <w:rFonts w:ascii="Arial" w:cs="Arial" w:eastAsia="Arial" w:hAnsi="Arial"/>
-                <w:b w:val="false"/>
-                <w:bCs w:val="false"/>
-                <w:color w:val="000000"/>
-                <w:sz w:val="18"/>
-                <w:szCs w:val="18"/>
-              </w:rPr>
-              <w:t xml:space="preserve">TMDB enrichment script written + tested</w:t>
+            <w:tcW w:type="dxa" w:w="3600"/>
+            <w:tcBorders>
+              <w:top w:val="single" w:color="CCCCCC" w:sz="1"/>
+              <w:left w:val="single" w:color="CCCCCC" w:sz="1"/>
+              <w:bottom w:val="single" w:color="CCCCCC" w:sz="1"/>
+              <w:right w:val="single" w:color="CCCCCC" w:sz="1"/>
+            </w:tcBorders>
+            <w:shd w:fill="FFFFFF" w:val="clear"/>
+            <w:tcMar>
+              <w:top w:type="dxa" w:w="80"/>
+              <w:left w:type="dxa" w:w="120"/>
+              <w:bottom w:type="dxa" w:w="80"/>
+              <w:right w:type="dxa" w:w="120"/>
+            </w:tcMar>
+          </w:tcPr>
+          <w:p>
+            <w:r>
+              <w:rPr>
+                <w:rFonts w:ascii="Arial" w:cs="Arial" w:eastAsia="Arial" w:hAnsi="Arial"/>
+                <w:b w:val="false"/>
+                <w:bCs w:val="false"/>
+                <w:color w:val="000000"/>
+                <w:sz w:val="18"/>
+                <w:szCs w:val="18"/>
+              </w:rPr>
+              <w:t xml:space="preserve">.gitignore — API key protected from GitHub</w:t>
             </w:r>
           </w:p>
         </w:tc>
@@ -1345,13 +1473,13 @@
                 <w:sz w:val="18"/>
                 <w:szCs w:val="18"/>
               </w:rPr>
-              <w:t xml:space="preserve">backend/data/tmdb_enrichment.py</w:t>
-            </w:r>
-          </w:p>
-        </w:tc>
-        <w:tc>
-          <w:tcPr>
-            <w:tcW w:type="dxa" w:w="2026"/>
+              <w:t xml:space="preserve">.gitignore in repo root</w:t>
+            </w:r>
+          </w:p>
+        </w:tc>
+        <w:tc>
+          <w:tcPr>
+            <w:tcW w:type="dxa" w:w="2226"/>
             <w:tcBorders>
               <w:top w:val="single" w:color="CCCCCC" w:sz="1"/>
               <w:left w:val="single" w:color="CCCCCC" w:sz="1"/>
@@ -1415,32 +1543,32 @@
         </w:tc>
         <w:tc>
           <w:tcPr>
-            <w:tcW w:type="dxa" w:w="3800"/>
-            <w:tcBorders>
-              <w:top w:val="single" w:color="CCCCCC" w:sz="1"/>
-              <w:left w:val="single" w:color="CCCCCC" w:sz="1"/>
-              <w:bottom w:val="single" w:color="CCCCCC" w:sz="1"/>
-              <w:right w:val="single" w:color="CCCCCC" w:sz="1"/>
-            </w:tcBorders>
-            <w:shd w:fill="FFFFFF" w:val="clear"/>
-            <w:tcMar>
-              <w:top w:type="dxa" w:w="80"/>
-              <w:left w:type="dxa" w:w="120"/>
-              <w:bottom w:type="dxa" w:w="80"/>
-              <w:right w:type="dxa" w:w="120"/>
-            </w:tcMar>
-          </w:tcPr>
-          <w:p>
-            <w:r>
-              <w:rPr>
-                <w:rFonts w:ascii="Arial" w:cs="Arial" w:eastAsia="Arial" w:hAnsi="Arial"/>
-                <w:b w:val="false"/>
-                <w:bCs w:val="false"/>
-                <w:color w:val="000000"/>
-                <w:sz w:val="18"/>
-                <w:szCs w:val="18"/>
-              </w:rPr>
-              <w:t xml:space="preserve">20 movies enriched — 100% TMDB match</w:t>
+            <w:tcW w:type="dxa" w:w="3600"/>
+            <w:tcBorders>
+              <w:top w:val="single" w:color="CCCCCC" w:sz="1"/>
+              <w:left w:val="single" w:color="CCCCCC" w:sz="1"/>
+              <w:bottom w:val="single" w:color="CCCCCC" w:sz="1"/>
+              <w:right w:val="single" w:color="CCCCCC" w:sz="1"/>
+            </w:tcBorders>
+            <w:shd w:fill="FFFFFF" w:val="clear"/>
+            <w:tcMar>
+              <w:top w:type="dxa" w:w="80"/>
+              <w:left w:type="dxa" w:w="120"/>
+              <w:bottom w:type="dxa" w:w="80"/>
+              <w:right w:type="dxa" w:w="120"/>
+            </w:tcMar>
+          </w:tcPr>
+          <w:p>
+            <w:r>
+              <w:rPr>
+                <w:rFonts w:ascii="Arial" w:cs="Arial" w:eastAsia="Arial" w:hAnsi="Arial"/>
+                <w:b w:val="false"/>
+                <w:bCs w:val="false"/>
+                <w:color w:val="000000"/>
+                <w:sz w:val="18"/>
+                <w:szCs w:val="18"/>
+              </w:rPr>
+              <w:t xml:space="preserve">TMDB enrichment script — 20 movies tested</w:t>
             </w:r>
           </w:p>
         </w:tc>
@@ -1471,13 +1599,13 @@
                 <w:sz w:val="18"/>
                 <w:szCs w:val="18"/>
               </w:rPr>
-              <w:t xml:space="preserve">dataset/enriched/movies_enriched.csv</w:t>
-            </w:r>
-          </w:p>
-        </w:tc>
-        <w:tc>
-          <w:tcPr>
-            <w:tcW w:type="dxa" w:w="2026"/>
+              <w:t xml:space="preserve">movies_enriched.csv — 100% match</w:t>
+            </w:r>
+          </w:p>
+        </w:tc>
+        <w:tc>
+          <w:tcPr>
+            <w:tcW w:type="dxa" w:w="2226"/>
             <w:tcBorders>
               <w:top w:val="single" w:color="CCCCCC" w:sz="1"/>
               <w:left w:val="single" w:color="CCCCCC" w:sz="1"/>
@@ -1541,32 +1669,32 @@
         </w:tc>
         <w:tc>
           <w:tcPr>
-            <w:tcW w:type="dxa" w:w="3800"/>
-            <w:tcBorders>
-              <w:top w:val="single" w:color="CCCCCC" w:sz="1"/>
-              <w:left w:val="single" w:color="CCCCCC" w:sz="1"/>
-              <w:bottom w:val="single" w:color="CCCCCC" w:sz="1"/>
-              <w:right w:val="single" w:color="CCCCCC" w:sz="1"/>
-            </w:tcBorders>
-            <w:shd w:fill="FFFFFF" w:val="clear"/>
-            <w:tcMar>
-              <w:top w:type="dxa" w:w="80"/>
-              <w:left w:type="dxa" w:w="120"/>
-              <w:bottom w:type="dxa" w:w="80"/>
-              <w:right w:type="dxa" w:w="120"/>
-            </w:tcMar>
-          </w:tcPr>
-          <w:p>
-            <w:r>
-              <w:rPr>
-                <w:rFonts w:ascii="Arial" w:cs="Arial" w:eastAsia="Arial" w:hAnsi="Arial"/>
-                <w:b w:val="false"/>
-                <w:bCs w:val="false"/>
-                <w:color w:val="000000"/>
-                <w:sz w:val="18"/>
-                <w:szCs w:val="18"/>
-              </w:rPr>
-              <w:t xml:space="preserve">PostgreSQL 18 installed on Windows</w:t>
+            <w:tcW w:type="dxa" w:w="3600"/>
+            <w:tcBorders>
+              <w:top w:val="single" w:color="CCCCCC" w:sz="1"/>
+              <w:left w:val="single" w:color="CCCCCC" w:sz="1"/>
+              <w:bottom w:val="single" w:color="CCCCCC" w:sz="1"/>
+              <w:right w:val="single" w:color="CCCCCC" w:sz="1"/>
+            </w:tcBorders>
+            <w:shd w:fill="FFFFFF" w:val="clear"/>
+            <w:tcMar>
+              <w:top w:type="dxa" w:w="80"/>
+              <w:left w:type="dxa" w:w="120"/>
+              <w:bottom w:type="dxa" w:w="80"/>
+              <w:right w:type="dxa" w:w="120"/>
+            </w:tcMar>
+          </w:tcPr>
+          <w:p>
+            <w:r>
+              <w:rPr>
+                <w:rFonts w:ascii="Arial" w:cs="Arial" w:eastAsia="Arial" w:hAnsi="Arial"/>
+                <w:b w:val="false"/>
+                <w:bCs w:val="false"/>
+                <w:color w:val="000000"/>
+                <w:sz w:val="18"/>
+                <w:szCs w:val="18"/>
+              </w:rPr>
+              <w:t xml:space="preserve">PostgreSQL 18 installed + PATH configured</w:t>
             </w:r>
           </w:p>
         </w:tc>
@@ -1603,7 +1731,7 @@
         </w:tc>
         <w:tc>
           <w:tcPr>
-            <w:tcW w:type="dxa" w:w="2026"/>
+            <w:tcW w:type="dxa" w:w="2226"/>
             <w:tcBorders>
               <w:top w:val="single" w:color="CCCCCC" w:sz="1"/>
               <w:left w:val="single" w:color="CCCCCC" w:sz="1"/>
@@ -1667,7 +1795,7 @@
         </w:tc>
         <w:tc>
           <w:tcPr>
-            <w:tcW w:type="dxa" w:w="3800"/>
+            <w:tcW w:type="dxa" w:w="3600"/>
             <w:tcBorders>
               <w:top w:val="single" w:color="CCCCCC" w:sz="1"/>
               <w:left w:val="single" w:color="CCCCCC" w:sz="1"/>
@@ -1729,7 +1857,7 @@
         </w:tc>
         <w:tc>
           <w:tcPr>
-            <w:tcW w:type="dxa" w:w="2026"/>
+            <w:tcW w:type="dxa" w:w="2226"/>
             <w:tcBorders>
               <w:top w:val="single" w:color="CCCCCC" w:sz="1"/>
               <w:left w:val="single" w:color="CCCCCC" w:sz="1"/>
@@ -1793,7 +1921,7 @@
         </w:tc>
         <w:tc>
           <w:tcPr>
-            <w:tcW w:type="dxa" w:w="3800"/>
+            <w:tcW w:type="dxa" w:w="3600"/>
             <w:tcBorders>
               <w:top w:val="single" w:color="CCCCCC" w:sz="1"/>
               <w:left w:val="single" w:color="CCCCCC" w:sz="1"/>
@@ -1849,13 +1977,13 @@
                 <w:sz w:val="18"/>
                 <w:szCs w:val="18"/>
               </w:rPr>
-              <w:t xml:space="preserve">psql dt → 6 rows confirmed</w:t>
-            </w:r>
-          </w:p>
-        </w:tc>
-        <w:tc>
-          <w:tcPr>
-            <w:tcW w:type="dxa" w:w="2026"/>
+              <w:t xml:space="preserve">psql dt → 6 rows</w:t>
+            </w:r>
+          </w:p>
+        </w:tc>
+        <w:tc>
+          <w:tcPr>
+            <w:tcW w:type="dxa" w:w="2226"/>
             <w:tcBorders>
               <w:top w:val="single" w:color="CCCCCC" w:sz="1"/>
               <w:left w:val="single" w:color="CCCCCC" w:sz="1"/>
@@ -1919,32 +2047,32 @@
         </w:tc>
         <w:tc>
           <w:tcPr>
-            <w:tcW w:type="dxa" w:w="3800"/>
-            <w:tcBorders>
-              <w:top w:val="single" w:color="CCCCCC" w:sz="1"/>
-              <w:left w:val="single" w:color="CCCCCC" w:sz="1"/>
-              <w:bottom w:val="single" w:color="CCCCCC" w:sz="1"/>
-              <w:right w:val="single" w:color="CCCCCC" w:sz="1"/>
-            </w:tcBorders>
-            <w:shd w:fill="FFFFFF" w:val="clear"/>
-            <w:tcMar>
-              <w:top w:type="dxa" w:w="80"/>
-              <w:left w:type="dxa" w:w="120"/>
-              <w:bottom w:type="dxa" w:w="80"/>
-              <w:right w:type="dxa" w:w="120"/>
-            </w:tcMar>
-          </w:tcPr>
-          <w:p>
-            <w:r>
-              <w:rPr>
-                <w:rFonts w:ascii="Arial" w:cs="Arial" w:eastAsia="Arial" w:hAnsi="Arial"/>
-                <w:b w:val="false"/>
-                <w:bCs w:val="false"/>
-                <w:color w:val="000000"/>
-                <w:sz w:val="18"/>
-                <w:szCs w:val="18"/>
-              </w:rPr>
-              <w:t xml:space="preserve">SQL schema committed to GitHub</w:t>
+            <w:tcW w:type="dxa" w:w="3600"/>
+            <w:tcBorders>
+              <w:top w:val="single" w:color="CCCCCC" w:sz="1"/>
+              <w:left w:val="single" w:color="CCCCCC" w:sz="1"/>
+              <w:bottom w:val="single" w:color="CCCCCC" w:sz="1"/>
+              <w:right w:val="single" w:color="CCCCCC" w:sz="1"/>
+            </w:tcBorders>
+            <w:shd w:fill="FFFFFF" w:val="clear"/>
+            <w:tcMar>
+              <w:top w:type="dxa" w:w="80"/>
+              <w:left w:type="dxa" w:w="120"/>
+              <w:bottom w:type="dxa" w:w="80"/>
+              <w:right w:type="dxa" w:w="120"/>
+            </w:tcMar>
+          </w:tcPr>
+          <w:p>
+            <w:r>
+              <w:rPr>
+                <w:rFonts w:ascii="Arial" w:cs="Arial" w:eastAsia="Arial" w:hAnsi="Arial"/>
+                <w:b w:val="false"/>
+                <w:bCs w:val="false"/>
+                <w:color w:val="000000"/>
+                <w:sz w:val="18"/>
+                <w:szCs w:val="18"/>
+              </w:rPr>
+              <w:t xml:space="preserve">Unit tests written: test_database.py</w:t>
             </w:r>
           </w:p>
         </w:tc>
@@ -1975,13 +2103,265 @@
                 <w:sz w:val="18"/>
                 <w:szCs w:val="18"/>
               </w:rPr>
-              <w:t xml:space="preserve">backend/data/create_tables.sql</w:t>
-            </w:r>
-          </w:p>
-        </w:tc>
-        <w:tc>
-          <w:tcPr>
-            <w:tcW w:type="dxa" w:w="2026"/>
+              <w:t xml:space="preserve">tests/test_database.py — 5 tests</w:t>
+            </w:r>
+          </w:p>
+        </w:tc>
+        <w:tc>
+          <w:tcPr>
+            <w:tcW w:type="dxa" w:w="2226"/>
+            <w:tcBorders>
+              <w:top w:val="single" w:color="CCCCCC" w:sz="1"/>
+              <w:left w:val="single" w:color="CCCCCC" w:sz="1"/>
+              <w:bottom w:val="single" w:color="CCCCCC" w:sz="1"/>
+              <w:right w:val="single" w:color="CCCCCC" w:sz="1"/>
+            </w:tcBorders>
+            <w:shd w:fill="E2EFDA" w:val="clear"/>
+            <w:tcMar>
+              <w:top w:type="dxa" w:w="80"/>
+              <w:left w:type="dxa" w:w="120"/>
+              <w:bottom w:type="dxa" w:w="80"/>
+              <w:right w:type="dxa" w:w="120"/>
+            </w:tcMar>
+          </w:tcPr>
+          <w:p>
+            <w:r>
+              <w:rPr>
+                <w:rFonts w:ascii="Arial" w:cs="Arial" w:eastAsia="Arial" w:hAnsi="Arial"/>
+                <w:b/>
+                <w:bCs/>
+                <w:color w:val="375623"/>
+                <w:sz w:val="18"/>
+                <w:szCs w:val="18"/>
+              </w:rPr>
+              <w:t xml:space="preserve">✅ Done</w:t>
+            </w:r>
+          </w:p>
+        </w:tc>
+      </w:tr>
+      <w:tr>
+        <w:tc>
+          <w:tcPr>
+            <w:tcW w:type="dxa" w:w="400"/>
+            <w:tcBorders>
+              <w:top w:val="single" w:color="CCCCCC" w:sz="1"/>
+              <w:left w:val="single" w:color="CCCCCC" w:sz="1"/>
+              <w:bottom w:val="single" w:color="CCCCCC" w:sz="1"/>
+              <w:right w:val="single" w:color="CCCCCC" w:sz="1"/>
+            </w:tcBorders>
+            <w:shd w:fill="F2F2F2" w:val="clear"/>
+            <w:tcMar>
+              <w:top w:type="dxa" w:w="80"/>
+              <w:left w:type="dxa" w:w="120"/>
+              <w:bottom w:type="dxa" w:w="80"/>
+              <w:right w:type="dxa" w:w="120"/>
+            </w:tcMar>
+          </w:tcPr>
+          <w:p>
+            <w:r>
+              <w:rPr>
+                <w:rFonts w:ascii="Arial" w:cs="Arial" w:eastAsia="Arial" w:hAnsi="Arial"/>
+                <w:b/>
+                <w:bCs/>
+                <w:color w:val="000000"/>
+                <w:sz w:val="18"/>
+                <w:szCs w:val="18"/>
+              </w:rPr>
+              <w:t xml:space="preserve">11</w:t>
+            </w:r>
+          </w:p>
+        </w:tc>
+        <w:tc>
+          <w:tcPr>
+            <w:tcW w:type="dxa" w:w="3600"/>
+            <w:tcBorders>
+              <w:top w:val="single" w:color="CCCCCC" w:sz="1"/>
+              <w:left w:val="single" w:color="CCCCCC" w:sz="1"/>
+              <w:bottom w:val="single" w:color="CCCCCC" w:sz="1"/>
+              <w:right w:val="single" w:color="CCCCCC" w:sz="1"/>
+            </w:tcBorders>
+            <w:shd w:fill="FFFFFF" w:val="clear"/>
+            <w:tcMar>
+              <w:top w:type="dxa" w:w="80"/>
+              <w:left w:type="dxa" w:w="120"/>
+              <w:bottom w:type="dxa" w:w="80"/>
+              <w:right w:type="dxa" w:w="120"/>
+            </w:tcMar>
+          </w:tcPr>
+          <w:p>
+            <w:r>
+              <w:rPr>
+                <w:rFonts w:ascii="Arial" w:cs="Arial" w:eastAsia="Arial" w:hAnsi="Arial"/>
+                <w:b w:val="false"/>
+                <w:bCs w:val="false"/>
+                <w:color w:val="000000"/>
+                <w:sz w:val="18"/>
+                <w:szCs w:val="18"/>
+              </w:rPr>
+              <w:t xml:space="preserve">Unit tests written: test_nlp.py</w:t>
+            </w:r>
+          </w:p>
+        </w:tc>
+        <w:tc>
+          <w:tcPr>
+            <w:tcW w:type="dxa" w:w="2800"/>
+            <w:tcBorders>
+              <w:top w:val="single" w:color="CCCCCC" w:sz="1"/>
+              <w:left w:val="single" w:color="CCCCCC" w:sz="1"/>
+              <w:bottom w:val="single" w:color="CCCCCC" w:sz="1"/>
+              <w:right w:val="single" w:color="CCCCCC" w:sz="1"/>
+            </w:tcBorders>
+            <w:shd w:fill="FFFFFF" w:val="clear"/>
+            <w:tcMar>
+              <w:top w:type="dxa" w:w="80"/>
+              <w:left w:type="dxa" w:w="120"/>
+              <w:bottom w:type="dxa" w:w="80"/>
+              <w:right w:type="dxa" w:w="120"/>
+            </w:tcMar>
+          </w:tcPr>
+          <w:p>
+            <w:r>
+              <w:rPr>
+                <w:rFonts w:ascii="Arial" w:cs="Arial" w:eastAsia="Arial" w:hAnsi="Arial"/>
+                <w:b w:val="false"/>
+                <w:bCs w:val="false"/>
+                <w:color w:val="000000"/>
+                <w:sz w:val="18"/>
+                <w:szCs w:val="18"/>
+              </w:rPr>
+              <w:t xml:space="preserve">tests/test_nlp.py — 8 tests</w:t>
+            </w:r>
+          </w:p>
+        </w:tc>
+        <w:tc>
+          <w:tcPr>
+            <w:tcW w:type="dxa" w:w="2226"/>
+            <w:tcBorders>
+              <w:top w:val="single" w:color="CCCCCC" w:sz="1"/>
+              <w:left w:val="single" w:color="CCCCCC" w:sz="1"/>
+              <w:bottom w:val="single" w:color="CCCCCC" w:sz="1"/>
+              <w:right w:val="single" w:color="CCCCCC" w:sz="1"/>
+            </w:tcBorders>
+            <w:shd w:fill="E2EFDA" w:val="clear"/>
+            <w:tcMar>
+              <w:top w:type="dxa" w:w="80"/>
+              <w:left w:type="dxa" w:w="120"/>
+              <w:bottom w:type="dxa" w:w="80"/>
+              <w:right w:type="dxa" w:w="120"/>
+            </w:tcMar>
+          </w:tcPr>
+          <w:p>
+            <w:r>
+              <w:rPr>
+                <w:rFonts w:ascii="Arial" w:cs="Arial" w:eastAsia="Arial" w:hAnsi="Arial"/>
+                <w:b/>
+                <w:bCs/>
+                <w:color w:val="375623"/>
+                <w:sz w:val="18"/>
+                <w:szCs w:val="18"/>
+              </w:rPr>
+              <w:t xml:space="preserve">✅ Done</w:t>
+            </w:r>
+          </w:p>
+        </w:tc>
+      </w:tr>
+      <w:tr>
+        <w:tc>
+          <w:tcPr>
+            <w:tcW w:type="dxa" w:w="400"/>
+            <w:tcBorders>
+              <w:top w:val="single" w:color="CCCCCC" w:sz="1"/>
+              <w:left w:val="single" w:color="CCCCCC" w:sz="1"/>
+              <w:bottom w:val="single" w:color="CCCCCC" w:sz="1"/>
+              <w:right w:val="single" w:color="CCCCCC" w:sz="1"/>
+            </w:tcBorders>
+            <w:shd w:fill="F2F2F2" w:val="clear"/>
+            <w:tcMar>
+              <w:top w:type="dxa" w:w="80"/>
+              <w:left w:type="dxa" w:w="120"/>
+              <w:bottom w:type="dxa" w:w="80"/>
+              <w:right w:type="dxa" w:w="120"/>
+            </w:tcMar>
+          </w:tcPr>
+          <w:p>
+            <w:r>
+              <w:rPr>
+                <w:rFonts w:ascii="Arial" w:cs="Arial" w:eastAsia="Arial" w:hAnsi="Arial"/>
+                <w:b/>
+                <w:bCs/>
+                <w:color w:val="000000"/>
+                <w:sz w:val="18"/>
+                <w:szCs w:val="18"/>
+              </w:rPr>
+              <w:t xml:space="preserve">12</w:t>
+            </w:r>
+          </w:p>
+        </w:tc>
+        <w:tc>
+          <w:tcPr>
+            <w:tcW w:type="dxa" w:w="3600"/>
+            <w:tcBorders>
+              <w:top w:val="single" w:color="CCCCCC" w:sz="1"/>
+              <w:left w:val="single" w:color="CCCCCC" w:sz="1"/>
+              <w:bottom w:val="single" w:color="CCCCCC" w:sz="1"/>
+              <w:right w:val="single" w:color="CCCCCC" w:sz="1"/>
+            </w:tcBorders>
+            <w:shd w:fill="FFFFFF" w:val="clear"/>
+            <w:tcMar>
+              <w:top w:type="dxa" w:w="80"/>
+              <w:left w:type="dxa" w:w="120"/>
+              <w:bottom w:type="dxa" w:w="80"/>
+              <w:right w:type="dxa" w:w="120"/>
+            </w:tcMar>
+          </w:tcPr>
+          <w:p>
+            <w:r>
+              <w:rPr>
+                <w:rFonts w:ascii="Arial" w:cs="Arial" w:eastAsia="Arial" w:hAnsi="Arial"/>
+                <w:b w:val="false"/>
+                <w:bCs w:val="false"/>
+                <w:color w:val="000000"/>
+                <w:sz w:val="18"/>
+                <w:szCs w:val="18"/>
+              </w:rPr>
+              <w:t xml:space="preserve">Unit tests written: test_tmdb.py</w:t>
+            </w:r>
+          </w:p>
+        </w:tc>
+        <w:tc>
+          <w:tcPr>
+            <w:tcW w:type="dxa" w:w="2800"/>
+            <w:tcBorders>
+              <w:top w:val="single" w:color="CCCCCC" w:sz="1"/>
+              <w:left w:val="single" w:color="CCCCCC" w:sz="1"/>
+              <w:bottom w:val="single" w:color="CCCCCC" w:sz="1"/>
+              <w:right w:val="single" w:color="CCCCCC" w:sz="1"/>
+            </w:tcBorders>
+            <w:shd w:fill="FFFFFF" w:val="clear"/>
+            <w:tcMar>
+              <w:top w:type="dxa" w:w="80"/>
+              <w:left w:type="dxa" w:w="120"/>
+              <w:bottom w:type="dxa" w:w="80"/>
+              <w:right w:type="dxa" w:w="120"/>
+            </w:tcMar>
+          </w:tcPr>
+          <w:p>
+            <w:r>
+              <w:rPr>
+                <w:rFonts w:ascii="Arial" w:cs="Arial" w:eastAsia="Arial" w:hAnsi="Arial"/>
+                <w:b w:val="false"/>
+                <w:bCs w:val="false"/>
+                <w:color w:val="000000"/>
+                <w:sz w:val="18"/>
+                <w:szCs w:val="18"/>
+              </w:rPr>
+              <w:t xml:space="preserve">tests/test_tmdb.py — 5 tests</w:t>
+            </w:r>
+          </w:p>
+        </w:tc>
+        <w:tc>
+          <w:tcPr>
+            <w:tcW w:type="dxa" w:w="2226"/>
             <w:tcBorders>
               <w:top w:val="single" w:color="CCCCCC" w:sz="1"/>
               <w:left w:val="single" w:color="CCCCCC" w:sz="1"/>
@@ -2036,12 +2416,838 @@
           <w:sz w:val="26"/>
           <w:szCs w:val="26"/>
         </w:rPr>
-        <w:t xml:space="preserve">3. TMDB Enrichment Results</w:t>
+        <w:t xml:space="preserve">3. Unit Test Results — 18/18 PASSED ✅</w:t>
+      </w:r>
+    </w:p>
+    <w:p>
+      <w:pPr>
+        <w:spacing w:after="80" w:before="80"/>
+      </w:pPr>
+      <w:r>
+        <w:rPr>
+          <w:rFonts w:ascii="Arial" w:cs="Arial" w:eastAsia="Arial" w:hAnsi="Arial"/>
+          <w:b w:val="false"/>
+          <w:bCs w:val="false"/>
+          <w:color w:val="000000"/>
+          <w:sz w:val="20"/>
+          <w:szCs w:val="20"/>
+        </w:rPr>
+        <w:t xml:space="preserve">All 18 unit tests passed successfully on 25 June 2026. Tests were run using pytest 9.1.1 on Python 3.14.5:</w:t>
+      </w:r>
+    </w:p>
+    <w:p>
+      <w:pPr>
+        <w:spacing w:after="80" w:before="80"/>
+      </w:pPr>
+      <w:r>
+        <w:t xml:space="preserve"/>
       </w:r>
     </w:p>
     <w:tbl>
       <w:tblPr>
-        <w:tblW w:type="auto" w:w="100"/>
+        <w:tblW w:type="dxa" w:w="9026"/>
+        <w:tblBorders>
+          <w:top w:val="single" w:color="auto" w:sz="4"/>
+          <w:left w:val="single" w:color="auto" w:sz="4"/>
+          <w:bottom w:val="single" w:color="auto" w:sz="4"/>
+          <w:right w:val="single" w:color="auto" w:sz="4"/>
+          <w:insideH w:val="single" w:color="auto" w:sz="4"/>
+          <w:insideV w:val="single" w:color="auto" w:sz="4"/>
+        </w:tblBorders>
+      </w:tblPr>
+      <w:tblGrid>
+        <w:gridCol w:w="3200"/>
+        <w:gridCol w:w="1400"/>
+        <w:gridCol w:w="1400"/>
+        <w:gridCol w:w="3026"/>
+      </w:tblGrid>
+      <w:tr>
+        <w:tc>
+          <w:tcPr>
+            <w:tcW w:type="dxa" w:w="3200"/>
+            <w:tcBorders>
+              <w:top w:val="single" w:color="CCCCCC" w:sz="1"/>
+              <w:left w:val="single" w:color="CCCCCC" w:sz="1"/>
+              <w:bottom w:val="single" w:color="CCCCCC" w:sz="1"/>
+              <w:right w:val="single" w:color="CCCCCC" w:sz="1"/>
+            </w:tcBorders>
+            <w:shd w:fill="1F3864" w:val="clear"/>
+            <w:tcMar>
+              <w:top w:type="dxa" w:w="80"/>
+              <w:left w:type="dxa" w:w="120"/>
+              <w:bottom w:type="dxa" w:w="80"/>
+              <w:right w:type="dxa" w:w="120"/>
+            </w:tcMar>
+          </w:tcPr>
+          <w:p>
+            <w:pPr>
+              <w:jc w:val="center"/>
+            </w:pPr>
+            <w:r>
+              <w:rPr>
+                <w:rFonts w:ascii="Arial" w:cs="Arial" w:eastAsia="Arial" w:hAnsi="Arial"/>
+                <w:b/>
+                <w:bCs/>
+                <w:color w:val="FFFFFF"/>
+                <w:sz w:val="19"/>
+                <w:szCs w:val="19"/>
+              </w:rPr>
+              <w:t xml:space="preserve">Test File</w:t>
+            </w:r>
+          </w:p>
+        </w:tc>
+        <w:tc>
+          <w:tcPr>
+            <w:tcW w:type="dxa" w:w="1400"/>
+            <w:tcBorders>
+              <w:top w:val="single" w:color="CCCCCC" w:sz="1"/>
+              <w:left w:val="single" w:color="CCCCCC" w:sz="1"/>
+              <w:bottom w:val="single" w:color="CCCCCC" w:sz="1"/>
+              <w:right w:val="single" w:color="CCCCCC" w:sz="1"/>
+            </w:tcBorders>
+            <w:shd w:fill="1F3864" w:val="clear"/>
+            <w:tcMar>
+              <w:top w:type="dxa" w:w="80"/>
+              <w:left w:type="dxa" w:w="120"/>
+              <w:bottom w:type="dxa" w:w="80"/>
+              <w:right w:type="dxa" w:w="120"/>
+            </w:tcMar>
+          </w:tcPr>
+          <w:p>
+            <w:pPr>
+              <w:jc w:val="center"/>
+            </w:pPr>
+            <w:r>
+              <w:rPr>
+                <w:rFonts w:ascii="Arial" w:cs="Arial" w:eastAsia="Arial" w:hAnsi="Arial"/>
+                <w:b/>
+                <w:bCs/>
+                <w:color w:val="FFFFFF"/>
+                <w:sz w:val="19"/>
+                <w:szCs w:val="19"/>
+              </w:rPr>
+              <w:t xml:space="preserve">Tests</w:t>
+            </w:r>
+          </w:p>
+        </w:tc>
+        <w:tc>
+          <w:tcPr>
+            <w:tcW w:type="dxa" w:w="1400"/>
+            <w:tcBorders>
+              <w:top w:val="single" w:color="CCCCCC" w:sz="1"/>
+              <w:left w:val="single" w:color="CCCCCC" w:sz="1"/>
+              <w:bottom w:val="single" w:color="CCCCCC" w:sz="1"/>
+              <w:right w:val="single" w:color="CCCCCC" w:sz="1"/>
+            </w:tcBorders>
+            <w:shd w:fill="1F3864" w:val="clear"/>
+            <w:tcMar>
+              <w:top w:type="dxa" w:w="80"/>
+              <w:left w:type="dxa" w:w="120"/>
+              <w:bottom w:type="dxa" w:w="80"/>
+              <w:right w:type="dxa" w:w="120"/>
+            </w:tcMar>
+          </w:tcPr>
+          <w:p>
+            <w:pPr>
+              <w:jc w:val="center"/>
+            </w:pPr>
+            <w:r>
+              <w:rPr>
+                <w:rFonts w:ascii="Arial" w:cs="Arial" w:eastAsia="Arial" w:hAnsi="Arial"/>
+                <w:b/>
+                <w:bCs/>
+                <w:color w:val="FFFFFF"/>
+                <w:sz w:val="19"/>
+                <w:szCs w:val="19"/>
+              </w:rPr>
+              <w:t xml:space="preserve">Passed</w:t>
+            </w:r>
+          </w:p>
+        </w:tc>
+        <w:tc>
+          <w:tcPr>
+            <w:tcW w:type="dxa" w:w="3026"/>
+            <w:tcBorders>
+              <w:top w:val="single" w:color="CCCCCC" w:sz="1"/>
+              <w:left w:val="single" w:color="CCCCCC" w:sz="1"/>
+              <w:bottom w:val="single" w:color="CCCCCC" w:sz="1"/>
+              <w:right w:val="single" w:color="CCCCCC" w:sz="1"/>
+            </w:tcBorders>
+            <w:shd w:fill="1F3864" w:val="clear"/>
+            <w:tcMar>
+              <w:top w:type="dxa" w:w="80"/>
+              <w:left w:type="dxa" w:w="120"/>
+              <w:bottom w:type="dxa" w:w="80"/>
+              <w:right w:type="dxa" w:w="120"/>
+            </w:tcMar>
+          </w:tcPr>
+          <w:p>
+            <w:pPr>
+              <w:jc w:val="center"/>
+            </w:pPr>
+            <w:r>
+              <w:rPr>
+                <w:rFonts w:ascii="Arial" w:cs="Arial" w:eastAsia="Arial" w:hAnsi="Arial"/>
+                <w:b/>
+                <w:bCs/>
+                <w:color w:val="FFFFFF"/>
+                <w:sz w:val="19"/>
+                <w:szCs w:val="19"/>
+              </w:rPr>
+              <w:t xml:space="preserve">What is tested</w:t>
+            </w:r>
+          </w:p>
+        </w:tc>
+      </w:tr>
+      <w:tr>
+        <w:tc>
+          <w:tcPr>
+            <w:tcW w:type="dxa" w:w="3200"/>
+            <w:tcBorders>
+              <w:top w:val="single" w:color="CCCCCC" w:sz="1"/>
+              <w:left w:val="single" w:color="CCCCCC" w:sz="1"/>
+              <w:bottom w:val="single" w:color="CCCCCC" w:sz="1"/>
+              <w:right w:val="single" w:color="CCCCCC" w:sz="1"/>
+            </w:tcBorders>
+            <w:shd w:fill="F2F2F2" w:val="clear"/>
+            <w:tcMar>
+              <w:top w:type="dxa" w:w="80"/>
+              <w:left w:type="dxa" w:w="120"/>
+              <w:bottom w:type="dxa" w:w="80"/>
+              <w:right w:type="dxa" w:w="120"/>
+            </w:tcMar>
+          </w:tcPr>
+          <w:p>
+            <w:r>
+              <w:rPr>
+                <w:rFonts w:ascii="Arial" w:cs="Arial" w:eastAsia="Arial" w:hAnsi="Arial"/>
+                <w:b/>
+                <w:bCs/>
+                <w:color w:val="000000"/>
+                <w:sz w:val="18"/>
+                <w:szCs w:val="18"/>
+              </w:rPr>
+              <w:t xml:space="preserve">tests/test_database.py</w:t>
+            </w:r>
+          </w:p>
+        </w:tc>
+        <w:tc>
+          <w:tcPr>
+            <w:tcW w:type="dxa" w:w="1400"/>
+            <w:tcBorders>
+              <w:top w:val="single" w:color="CCCCCC" w:sz="1"/>
+              <w:left w:val="single" w:color="CCCCCC" w:sz="1"/>
+              <w:bottom w:val="single" w:color="CCCCCC" w:sz="1"/>
+              <w:right w:val="single" w:color="CCCCCC" w:sz="1"/>
+            </w:tcBorders>
+            <w:shd w:fill="FFFFFF" w:val="clear"/>
+            <w:tcMar>
+              <w:top w:type="dxa" w:w="80"/>
+              <w:left w:type="dxa" w:w="120"/>
+              <w:bottom w:type="dxa" w:w="80"/>
+              <w:right w:type="dxa" w:w="120"/>
+            </w:tcMar>
+          </w:tcPr>
+          <w:p>
+            <w:r>
+              <w:rPr>
+                <w:rFonts w:ascii="Arial" w:cs="Arial" w:eastAsia="Arial" w:hAnsi="Arial"/>
+                <w:b/>
+                <w:bCs/>
+                <w:color w:val="000000"/>
+                <w:sz w:val="18"/>
+                <w:szCs w:val="18"/>
+              </w:rPr>
+              <w:t xml:space="preserve">5</w:t>
+            </w:r>
+          </w:p>
+        </w:tc>
+        <w:tc>
+          <w:tcPr>
+            <w:tcW w:type="dxa" w:w="1400"/>
+            <w:tcBorders>
+              <w:top w:val="single" w:color="CCCCCC" w:sz="1"/>
+              <w:left w:val="single" w:color="CCCCCC" w:sz="1"/>
+              <w:bottom w:val="single" w:color="CCCCCC" w:sz="1"/>
+              <w:right w:val="single" w:color="CCCCCC" w:sz="1"/>
+            </w:tcBorders>
+            <w:shd w:fill="E2EFDA" w:val="clear"/>
+            <w:tcMar>
+              <w:top w:type="dxa" w:w="80"/>
+              <w:left w:type="dxa" w:w="120"/>
+              <w:bottom w:type="dxa" w:w="80"/>
+              <w:right w:type="dxa" w:w="120"/>
+            </w:tcMar>
+          </w:tcPr>
+          <w:p>
+            <w:r>
+              <w:rPr>
+                <w:rFonts w:ascii="Arial" w:cs="Arial" w:eastAsia="Arial" w:hAnsi="Arial"/>
+                <w:b/>
+                <w:bCs/>
+                <w:color w:val="375623"/>
+                <w:sz w:val="18"/>
+                <w:szCs w:val="18"/>
+              </w:rPr>
+              <w:t xml:space="preserve">5 ✅</w:t>
+            </w:r>
+          </w:p>
+        </w:tc>
+        <w:tc>
+          <w:tcPr>
+            <w:tcW w:type="dxa" w:w="3026"/>
+            <w:tcBorders>
+              <w:top w:val="single" w:color="CCCCCC" w:sz="1"/>
+              <w:left w:val="single" w:color="CCCCCC" w:sz="1"/>
+              <w:bottom w:val="single" w:color="CCCCCC" w:sz="1"/>
+              <w:right w:val="single" w:color="CCCCCC" w:sz="1"/>
+            </w:tcBorders>
+            <w:shd w:fill="FFFFFF" w:val="clear"/>
+            <w:tcMar>
+              <w:top w:type="dxa" w:w="80"/>
+              <w:left w:type="dxa" w:w="120"/>
+              <w:bottom w:type="dxa" w:w="80"/>
+              <w:right w:type="dxa" w:w="120"/>
+            </w:tcMar>
+          </w:tcPr>
+          <w:p>
+            <w:r>
+              <w:rPr>
+                <w:rFonts w:ascii="Arial" w:cs="Arial" w:eastAsia="Arial" w:hAnsi="Arial"/>
+                <w:b w:val="false"/>
+                <w:bCs w:val="false"/>
+                <w:color w:val="000000"/>
+                <w:sz w:val="18"/>
+                <w:szCs w:val="18"/>
+              </w:rPr>
+              <w:t xml:space="preserve">DB connection, all 6 tables exist, column validation, mode column</w:t>
+            </w:r>
+          </w:p>
+        </w:tc>
+      </w:tr>
+      <w:tr>
+        <w:tc>
+          <w:tcPr>
+            <w:tcW w:type="dxa" w:w="3200"/>
+            <w:tcBorders>
+              <w:top w:val="single" w:color="CCCCCC" w:sz="1"/>
+              <w:left w:val="single" w:color="CCCCCC" w:sz="1"/>
+              <w:bottom w:val="single" w:color="CCCCCC" w:sz="1"/>
+              <w:right w:val="single" w:color="CCCCCC" w:sz="1"/>
+            </w:tcBorders>
+            <w:shd w:fill="F2F2F2" w:val="clear"/>
+            <w:tcMar>
+              <w:top w:type="dxa" w:w="80"/>
+              <w:left w:type="dxa" w:w="120"/>
+              <w:bottom w:type="dxa" w:w="80"/>
+              <w:right w:type="dxa" w:w="120"/>
+            </w:tcMar>
+          </w:tcPr>
+          <w:p>
+            <w:r>
+              <w:rPr>
+                <w:rFonts w:ascii="Arial" w:cs="Arial" w:eastAsia="Arial" w:hAnsi="Arial"/>
+                <w:b/>
+                <w:bCs/>
+                <w:color w:val="000000"/>
+                <w:sz w:val="18"/>
+                <w:szCs w:val="18"/>
+              </w:rPr>
+              <w:t xml:space="preserve">tests/test_nlp.py</w:t>
+            </w:r>
+          </w:p>
+        </w:tc>
+        <w:tc>
+          <w:tcPr>
+            <w:tcW w:type="dxa" w:w="1400"/>
+            <w:tcBorders>
+              <w:top w:val="single" w:color="CCCCCC" w:sz="1"/>
+              <w:left w:val="single" w:color="CCCCCC" w:sz="1"/>
+              <w:bottom w:val="single" w:color="CCCCCC" w:sz="1"/>
+              <w:right w:val="single" w:color="CCCCCC" w:sz="1"/>
+            </w:tcBorders>
+            <w:shd w:fill="FFFFFF" w:val="clear"/>
+            <w:tcMar>
+              <w:top w:type="dxa" w:w="80"/>
+              <w:left w:type="dxa" w:w="120"/>
+              <w:bottom w:type="dxa" w:w="80"/>
+              <w:right w:type="dxa" w:w="120"/>
+            </w:tcMar>
+          </w:tcPr>
+          <w:p>
+            <w:r>
+              <w:rPr>
+                <w:rFonts w:ascii="Arial" w:cs="Arial" w:eastAsia="Arial" w:hAnsi="Arial"/>
+                <w:b/>
+                <w:bCs/>
+                <w:color w:val="000000"/>
+                <w:sz w:val="18"/>
+                <w:szCs w:val="18"/>
+              </w:rPr>
+              <w:t xml:space="preserve">8</w:t>
+            </w:r>
+          </w:p>
+        </w:tc>
+        <w:tc>
+          <w:tcPr>
+            <w:tcW w:type="dxa" w:w="1400"/>
+            <w:tcBorders>
+              <w:top w:val="single" w:color="CCCCCC" w:sz="1"/>
+              <w:left w:val="single" w:color="CCCCCC" w:sz="1"/>
+              <w:bottom w:val="single" w:color="CCCCCC" w:sz="1"/>
+              <w:right w:val="single" w:color="CCCCCC" w:sz="1"/>
+            </w:tcBorders>
+            <w:shd w:fill="E2EFDA" w:val="clear"/>
+            <w:tcMar>
+              <w:top w:type="dxa" w:w="80"/>
+              <w:left w:type="dxa" w:w="120"/>
+              <w:bottom w:type="dxa" w:w="80"/>
+              <w:right w:type="dxa" w:w="120"/>
+            </w:tcMar>
+          </w:tcPr>
+          <w:p>
+            <w:r>
+              <w:rPr>
+                <w:rFonts w:ascii="Arial" w:cs="Arial" w:eastAsia="Arial" w:hAnsi="Arial"/>
+                <w:b/>
+                <w:bCs/>
+                <w:color w:val="375623"/>
+                <w:sz w:val="18"/>
+                <w:szCs w:val="18"/>
+              </w:rPr>
+              <w:t xml:space="preserve">8 ✅</w:t>
+            </w:r>
+          </w:p>
+        </w:tc>
+        <w:tc>
+          <w:tcPr>
+            <w:tcW w:type="dxa" w:w="3026"/>
+            <w:tcBorders>
+              <w:top w:val="single" w:color="CCCCCC" w:sz="1"/>
+              <w:left w:val="single" w:color="CCCCCC" w:sz="1"/>
+              <w:bottom w:val="single" w:color="CCCCCC" w:sz="1"/>
+              <w:right w:val="single" w:color="CCCCCC" w:sz="1"/>
+            </w:tcBorders>
+            <w:shd w:fill="FFFFFF" w:val="clear"/>
+            <w:tcMar>
+              <w:top w:type="dxa" w:w="80"/>
+              <w:left w:type="dxa" w:w="120"/>
+              <w:bottom w:type="dxa" w:w="80"/>
+              <w:right w:type="dxa" w:w="120"/>
+            </w:tcMar>
+          </w:tcPr>
+          <w:p>
+            <w:r>
+              <w:rPr>
+                <w:rFonts w:ascii="Arial" w:cs="Arial" w:eastAsia="Arial" w:hAnsi="Arial"/>
+                <w:b w:val="false"/>
+                <w:bCs w:val="false"/>
+                <w:color w:val="000000"/>
+                <w:sz w:val="18"/>
+                <w:szCs w:val="18"/>
+              </w:rPr>
+              <w:t xml:space="preserve">Model loads, joy/fear/sadness/anger detection, 7 emotions, scores sum to 1</w:t>
+            </w:r>
+          </w:p>
+        </w:tc>
+      </w:tr>
+      <w:tr>
+        <w:tc>
+          <w:tcPr>
+            <w:tcW w:type="dxa" w:w="3200"/>
+            <w:tcBorders>
+              <w:top w:val="single" w:color="CCCCCC" w:sz="1"/>
+              <w:left w:val="single" w:color="CCCCCC" w:sz="1"/>
+              <w:bottom w:val="single" w:color="CCCCCC" w:sz="1"/>
+              <w:right w:val="single" w:color="CCCCCC" w:sz="1"/>
+            </w:tcBorders>
+            <w:shd w:fill="F2F2F2" w:val="clear"/>
+            <w:tcMar>
+              <w:top w:type="dxa" w:w="80"/>
+              <w:left w:type="dxa" w:w="120"/>
+              <w:bottom w:type="dxa" w:w="80"/>
+              <w:right w:type="dxa" w:w="120"/>
+            </w:tcMar>
+          </w:tcPr>
+          <w:p>
+            <w:r>
+              <w:rPr>
+                <w:rFonts w:ascii="Arial" w:cs="Arial" w:eastAsia="Arial" w:hAnsi="Arial"/>
+                <w:b/>
+                <w:bCs/>
+                <w:color w:val="000000"/>
+                <w:sz w:val="18"/>
+                <w:szCs w:val="18"/>
+              </w:rPr>
+              <w:t xml:space="preserve">tests/test_tmdb.py</w:t>
+            </w:r>
+          </w:p>
+        </w:tc>
+        <w:tc>
+          <w:tcPr>
+            <w:tcW w:type="dxa" w:w="1400"/>
+            <w:tcBorders>
+              <w:top w:val="single" w:color="CCCCCC" w:sz="1"/>
+              <w:left w:val="single" w:color="CCCCCC" w:sz="1"/>
+              <w:bottom w:val="single" w:color="CCCCCC" w:sz="1"/>
+              <w:right w:val="single" w:color="CCCCCC" w:sz="1"/>
+            </w:tcBorders>
+            <w:shd w:fill="FFFFFF" w:val="clear"/>
+            <w:tcMar>
+              <w:top w:type="dxa" w:w="80"/>
+              <w:left w:type="dxa" w:w="120"/>
+              <w:bottom w:type="dxa" w:w="80"/>
+              <w:right w:type="dxa" w:w="120"/>
+            </w:tcMar>
+          </w:tcPr>
+          <w:p>
+            <w:r>
+              <w:rPr>
+                <w:rFonts w:ascii="Arial" w:cs="Arial" w:eastAsia="Arial" w:hAnsi="Arial"/>
+                <w:b/>
+                <w:bCs/>
+                <w:color w:val="000000"/>
+                <w:sz w:val="18"/>
+                <w:szCs w:val="18"/>
+              </w:rPr>
+              <w:t xml:space="preserve">5</w:t>
+            </w:r>
+          </w:p>
+        </w:tc>
+        <w:tc>
+          <w:tcPr>
+            <w:tcW w:type="dxa" w:w="1400"/>
+            <w:tcBorders>
+              <w:top w:val="single" w:color="CCCCCC" w:sz="1"/>
+              <w:left w:val="single" w:color="CCCCCC" w:sz="1"/>
+              <w:bottom w:val="single" w:color="CCCCCC" w:sz="1"/>
+              <w:right w:val="single" w:color="CCCCCC" w:sz="1"/>
+            </w:tcBorders>
+            <w:shd w:fill="E2EFDA" w:val="clear"/>
+            <w:tcMar>
+              <w:top w:type="dxa" w:w="80"/>
+              <w:left w:type="dxa" w:w="120"/>
+              <w:bottom w:type="dxa" w:w="80"/>
+              <w:right w:type="dxa" w:w="120"/>
+            </w:tcMar>
+          </w:tcPr>
+          <w:p>
+            <w:r>
+              <w:rPr>
+                <w:rFonts w:ascii="Arial" w:cs="Arial" w:eastAsia="Arial" w:hAnsi="Arial"/>
+                <w:b/>
+                <w:bCs/>
+                <w:color w:val="375623"/>
+                <w:sz w:val="18"/>
+                <w:szCs w:val="18"/>
+              </w:rPr>
+              <w:t xml:space="preserve">5 ✅</w:t>
+            </w:r>
+          </w:p>
+        </w:tc>
+        <w:tc>
+          <w:tcPr>
+            <w:tcW w:type="dxa" w:w="3026"/>
+            <w:tcBorders>
+              <w:top w:val="single" w:color="CCCCCC" w:sz="1"/>
+              <w:left w:val="single" w:color="CCCCCC" w:sz="1"/>
+              <w:bottom w:val="single" w:color="CCCCCC" w:sz="1"/>
+              <w:right w:val="single" w:color="CCCCCC" w:sz="1"/>
+            </w:tcBorders>
+            <w:shd w:fill="FFFFFF" w:val="clear"/>
+            <w:tcMar>
+              <w:top w:type="dxa" w:w="80"/>
+              <w:left w:type="dxa" w:w="120"/>
+              <w:bottom w:type="dxa" w:w="80"/>
+              <w:right w:type="dxa" w:w="120"/>
+            </w:tcMar>
+          </w:tcPr>
+          <w:p>
+            <w:r>
+              <w:rPr>
+                <w:rFonts w:ascii="Arial" w:cs="Arial" w:eastAsia="Arial" w:hAnsi="Arial"/>
+                <w:b w:val="false"/>
+                <w:bCs w:val="false"/>
+                <w:color w:val="000000"/>
+                <w:sz w:val="18"/>
+                <w:szCs w:val="18"/>
+              </w:rPr>
+              <w:t xml:space="preserve">API key exists, connection works, Toy Story found, poster + overview present</w:t>
+            </w:r>
+          </w:p>
+        </w:tc>
+      </w:tr>
+      <w:tr>
+        <w:tc>
+          <w:tcPr>
+            <w:tcW w:type="dxa" w:w="3200"/>
+            <w:tcBorders>
+              <w:top w:val="single" w:color="CCCCCC" w:sz="1"/>
+              <w:left w:val="single" w:color="CCCCCC" w:sz="1"/>
+              <w:bottom w:val="single" w:color="CCCCCC" w:sz="1"/>
+              <w:right w:val="single" w:color="CCCCCC" w:sz="1"/>
+            </w:tcBorders>
+            <w:shd w:fill="1F3864" w:val="clear"/>
+            <w:tcMar>
+              <w:top w:type="dxa" w:w="80"/>
+              <w:left w:type="dxa" w:w="120"/>
+              <w:bottom w:type="dxa" w:w="80"/>
+              <w:right w:type="dxa" w:w="120"/>
+            </w:tcMar>
+          </w:tcPr>
+          <w:p>
+            <w:r>
+              <w:rPr>
+                <w:rFonts w:ascii="Arial" w:cs="Arial" w:eastAsia="Arial" w:hAnsi="Arial"/>
+                <w:b/>
+                <w:bCs/>
+                <w:color w:val="FFFFFF"/>
+                <w:sz w:val="18"/>
+                <w:szCs w:val="18"/>
+              </w:rPr>
+              <w:t xml:space="preserve">TOTAL</w:t>
+            </w:r>
+          </w:p>
+        </w:tc>
+        <w:tc>
+          <w:tcPr>
+            <w:tcW w:type="dxa" w:w="1400"/>
+            <w:tcBorders>
+              <w:top w:val="single" w:color="CCCCCC" w:sz="1"/>
+              <w:left w:val="single" w:color="CCCCCC" w:sz="1"/>
+              <w:bottom w:val="single" w:color="CCCCCC" w:sz="1"/>
+              <w:right w:val="single" w:color="CCCCCC" w:sz="1"/>
+            </w:tcBorders>
+            <w:shd w:fill="1F3864" w:val="clear"/>
+            <w:tcMar>
+              <w:top w:type="dxa" w:w="80"/>
+              <w:left w:type="dxa" w:w="120"/>
+              <w:bottom w:type="dxa" w:w="80"/>
+              <w:right w:type="dxa" w:w="120"/>
+            </w:tcMar>
+          </w:tcPr>
+          <w:p>
+            <w:r>
+              <w:rPr>
+                <w:rFonts w:ascii="Arial" w:cs="Arial" w:eastAsia="Arial" w:hAnsi="Arial"/>
+                <w:b/>
+                <w:bCs/>
+                <w:color w:val="FFFFFF"/>
+                <w:sz w:val="18"/>
+                <w:szCs w:val="18"/>
+              </w:rPr>
+              <w:t xml:space="preserve">18</w:t>
+            </w:r>
+          </w:p>
+        </w:tc>
+        <w:tc>
+          <w:tcPr>
+            <w:tcW w:type="dxa" w:w="1400"/>
+            <w:tcBorders>
+              <w:top w:val="single" w:color="CCCCCC" w:sz="1"/>
+              <w:left w:val="single" w:color="CCCCCC" w:sz="1"/>
+              <w:bottom w:val="single" w:color="CCCCCC" w:sz="1"/>
+              <w:right w:val="single" w:color="CCCCCC" w:sz="1"/>
+            </w:tcBorders>
+            <w:shd w:fill="E2EFDA" w:val="clear"/>
+            <w:tcMar>
+              <w:top w:type="dxa" w:w="80"/>
+              <w:left w:type="dxa" w:w="120"/>
+              <w:bottom w:type="dxa" w:w="80"/>
+              <w:right w:type="dxa" w:w="120"/>
+            </w:tcMar>
+          </w:tcPr>
+          <w:p>
+            <w:r>
+              <w:rPr>
+                <w:rFonts w:ascii="Arial" w:cs="Arial" w:eastAsia="Arial" w:hAnsi="Arial"/>
+                <w:b/>
+                <w:bCs/>
+                <w:color w:val="375623"/>
+                <w:sz w:val="18"/>
+                <w:szCs w:val="18"/>
+              </w:rPr>
+              <w:t xml:space="preserve">18 ✅</w:t>
+            </w:r>
+          </w:p>
+        </w:tc>
+        <w:tc>
+          <w:tcPr>
+            <w:tcW w:type="dxa" w:w="3026"/>
+            <w:tcBorders>
+              <w:top w:val="single" w:color="CCCCCC" w:sz="1"/>
+              <w:left w:val="single" w:color="CCCCCC" w:sz="1"/>
+              <w:bottom w:val="single" w:color="CCCCCC" w:sz="1"/>
+              <w:right w:val="single" w:color="CCCCCC" w:sz="1"/>
+            </w:tcBorders>
+            <w:shd w:fill="FFFFFF" w:val="clear"/>
+            <w:tcMar>
+              <w:top w:type="dxa" w:w="80"/>
+              <w:left w:type="dxa" w:w="120"/>
+              <w:bottom w:type="dxa" w:w="80"/>
+              <w:right w:type="dxa" w:w="120"/>
+            </w:tcMar>
+          </w:tcPr>
+          <w:p>
+            <w:r>
+              <w:rPr>
+                <w:rFonts w:ascii="Arial" w:cs="Arial" w:eastAsia="Arial" w:hAnsi="Arial"/>
+                <w:b w:val="false"/>
+                <w:bCs w:val="false"/>
+                <w:color w:val="000000"/>
+                <w:sz w:val="18"/>
+                <w:szCs w:val="18"/>
+              </w:rPr>
+              <w:t xml:space="preserve">100% pass rate — 17.36 seconds runtime</w:t>
+            </w:r>
+          </w:p>
+        </w:tc>
+      </w:tr>
+    </w:tbl>
+    <w:p>
+      <w:pPr>
+        <w:spacing w:after="80" w:before="80"/>
+      </w:pPr>
+      <w:r>
+        <w:t xml:space="preserve"/>
+      </w:r>
+    </w:p>
+    <w:p>
+      <w:pPr>
+        <w:spacing w:after="80" w:before="140"/>
+      </w:pPr>
+      <w:r>
+        <w:rPr>
+          <w:rFonts w:ascii="Arial" w:cs="Arial" w:eastAsia="Arial" w:hAnsi="Arial"/>
+          <w:b/>
+          <w:bCs/>
+          <w:color w:val="2E75B6"/>
+          <w:sz w:val="22"/>
+          <w:szCs w:val="22"/>
+        </w:rPr>
+        <w:t xml:space="preserve">3.1  Key Test Validations</w:t>
+      </w:r>
+    </w:p>
+    <w:p>
+      <w:pPr>
+        <w:pStyle w:val="ListParagraph"/>
+        <w:numPr>
+          <w:ilvl w:val="0"/>
+          <w:numId w:val="2"/>
+        </w:numPr>
+        <w:spacing w:after="60" w:before="60"/>
+      </w:pPr>
+      <w:r>
+        <w:rPr>
+          <w:rFonts w:ascii="Arial" w:cs="Arial" w:eastAsia="Arial" w:hAnsi="Arial"/>
+          <w:sz w:val="19"/>
+          <w:szCs w:val="19"/>
+        </w:rPr>
+        <w:t xml:space="preserve">Database: All 6 tables confirmed present (users, movies, ratings, emotion_logs, recommendations, user_feedback)</w:t>
+      </w:r>
+    </w:p>
+    <w:p>
+      <w:pPr>
+        <w:pStyle w:val="ListParagraph"/>
+        <w:numPr>
+          <w:ilvl w:val="0"/>
+          <w:numId w:val="2"/>
+        </w:numPr>
+        <w:spacing w:after="60" w:before="60"/>
+      </w:pPr>
+      <w:r>
+        <w:rPr>
+          <w:rFonts w:ascii="Arial" w:cs="Arial" w:eastAsia="Arial" w:hAnsi="Arial"/>
+          <w:sz w:val="19"/>
+          <w:szCs w:val="19"/>
+        </w:rPr>
+        <w:t xml:space="preserve">Database: mode column confirmed in recommendations table — critical for research comparison</w:t>
+      </w:r>
+    </w:p>
+    <w:p>
+      <w:pPr>
+        <w:pStyle w:val="ListParagraph"/>
+        <w:numPr>
+          <w:ilvl w:val="0"/>
+          <w:numId w:val="2"/>
+        </w:numPr>
+        <w:spacing w:after="60" w:before="60"/>
+      </w:pPr>
+      <w:r>
+        <w:rPr>
+          <w:rFonts w:ascii="Arial" w:cs="Arial" w:eastAsia="Arial" w:hAnsi="Arial"/>
+          <w:sz w:val="19"/>
+          <w:szCs w:val="19"/>
+        </w:rPr>
+        <w:t xml:space="preserve">NLP: DistilRoBERTa correctly detects joy, fear, sadness, anger from natural language text</w:t>
+      </w:r>
+    </w:p>
+    <w:p>
+      <w:pPr>
+        <w:pStyle w:val="ListParagraph"/>
+        <w:numPr>
+          <w:ilvl w:val="0"/>
+          <w:numId w:val="2"/>
+        </w:numPr>
+        <w:spacing w:after="60" w:before="60"/>
+      </w:pPr>
+      <w:r>
+        <w:rPr>
+          <w:rFonts w:ascii="Arial" w:cs="Arial" w:eastAsia="Arial" w:hAnsi="Arial"/>
+          <w:sz w:val="19"/>
+          <w:szCs w:val="19"/>
+        </w:rPr>
+        <w:t xml:space="preserve">NLP: Model returns exactly 7 emotion scores summing to 1.0</w:t>
+      </w:r>
+    </w:p>
+    <w:p>
+      <w:pPr>
+        <w:pStyle w:val="ListParagraph"/>
+        <w:numPr>
+          <w:ilvl w:val="0"/>
+          <w:numId w:val="2"/>
+        </w:numPr>
+        <w:spacing w:after="60" w:before="60"/>
+      </w:pPr>
+      <w:r>
+        <w:rPr>
+          <w:rFonts w:ascii="Arial" w:cs="Arial" w:eastAsia="Arial" w:hAnsi="Arial"/>
+          <w:sz w:val="19"/>
+          <w:szCs w:val="19"/>
+        </w:rPr>
+        <w:t xml:space="preserve">TMDB: API key valid, connection live, Toy Story found with poster and overview</w:t>
+      </w:r>
+    </w:p>
+    <w:p>
+      <w:pPr>
+        <w:spacing w:after="80" w:before="80"/>
+      </w:pPr>
+      <w:r>
+        <w:t xml:space="preserve"/>
+      </w:r>
+    </w:p>
+    <w:p>
+      <w:pPr>
+        <w:pBdr>
+          <w:bottom w:val="single" w:color="2E75B6" w:sz="6" w:space="1"/>
+        </w:pBdr>
+        <w:spacing w:after="100" w:before="200"/>
+      </w:pPr>
+      <w:r>
+        <w:rPr>
+          <w:rFonts w:ascii="Arial" w:cs="Arial" w:eastAsia="Arial" w:hAnsi="Arial"/>
+          <w:b/>
+          <w:bCs/>
+          <w:color w:val="1F3864"/>
+          <w:sz w:val="26"/>
+          <w:szCs w:val="26"/>
+        </w:rPr>
+        <w:t xml:space="preserve">4. TMDB Enrichment Results</w:t>
+      </w:r>
+    </w:p>
+    <w:tbl>
+      <w:tblPr>
+        <w:tblW w:type="dxa" w:w="9026"/>
         <w:tblBorders>
           <w:top w:val="single" w:color="auto" w:sz="4"/>
           <w:left w:val="single" w:color="auto" w:sz="4"/>
@@ -2248,7 +3454,7 @@
                 <w:sz w:val="18"/>
                 <w:szCs w:val="18"/>
               </w:rPr>
-              <w:t xml:space="preserve">20/20 — 100%</w:t>
+              <w:t xml:space="preserve">20 / 20 — 100%</w:t>
             </w:r>
           </w:p>
         </w:tc>
@@ -2345,7 +3551,7 @@
                 <w:sz w:val="18"/>
                 <w:szCs w:val="18"/>
               </w:rPr>
-              <w:t xml:space="preserve">Best rated movie</w:t>
+              <w:t xml:space="preserve">Highest rated</w:t>
             </w:r>
           </w:p>
         </w:tc>
@@ -2409,7 +3615,7 @@
                 <w:sz w:val="18"/>
                 <w:szCs w:val="18"/>
               </w:rPr>
-              <w:t xml:space="preserve">Data fields fetched</w:t>
+              <w:t xml:space="preserve">Fields fetched</w:t>
             </w:r>
           </w:p>
         </w:tc>
@@ -2440,7 +3646,7 @@
                 <w:sz w:val="18"/>
                 <w:szCs w:val="18"/>
               </w:rPr>
-              <w:t xml:space="preserve">title, overview, poster_url, vote_average, cast, genres, release_date</w:t>
+              <w:t xml:space="preserve">title, overview, poster_url, vote_average, cast, genre_ids, release_date</w:t>
             </w:r>
           </w:p>
         </w:tc>
@@ -2473,7 +3679,7 @@
                 <w:sz w:val="18"/>
                 <w:szCs w:val="18"/>
               </w:rPr>
-              <w:t xml:space="preserve">Output saved</w:t>
+              <w:t xml:space="preserve">Output file</w:t>
             </w:r>
           </w:p>
         </w:tc>
@@ -2534,7 +3740,7 @@
           <w:sz w:val="26"/>
           <w:szCs w:val="26"/>
         </w:rPr>
-        <w:t xml:space="preserve">4. Database Status</w:t>
+        <w:t xml:space="preserve">5. Database Status</w:t>
       </w:r>
     </w:p>
     <w:tbl>
@@ -2843,7 +4049,7 @@
                 <w:sz w:val="18"/>
                 <w:szCs w:val="18"/>
               </w:rPr>
-              <w:t xml:space="preserve">MovieLens catalogue enriched with TMDB metadata</w:t>
+              <w:t xml:space="preserve">MovieLens + TMDB enriched movie catalogue</w:t>
             </w:r>
           </w:p>
         </w:tc>
@@ -3253,7 +4459,7 @@
           <w:sz w:val="26"/>
           <w:szCs w:val="26"/>
         </w:rPr>
-        <w:t xml:space="preserve">5. Problems &amp; Solutions</w:t>
+        <w:t xml:space="preserve">6. Evidence Files Collected</w:t>
       </w:r>
     </w:p>
     <w:tbl>
@@ -3269,14 +4475,14 @@
         </w:tblBorders>
       </w:tblPr>
       <w:tblGrid>
-        <w:gridCol w:w="3000"/>
-        <w:gridCol w:w="3000"/>
-        <w:gridCol w:w="3026"/>
+        <w:gridCol w:w="400"/>
+        <w:gridCol w:w="3500"/>
+        <w:gridCol w:w="5126"/>
       </w:tblGrid>
       <w:tr>
         <w:tc>
           <w:tcPr>
-            <w:tcW w:type="dxa" w:w="3000"/>
+            <w:tcW w:type="dxa" w:w="400"/>
             <w:tcBorders>
               <w:top w:val="single" w:color="CCCCCC" w:sz="1"/>
               <w:left w:val="single" w:color="CCCCCC" w:sz="1"/>
@@ -3304,13 +4510,13 @@
                 <w:sz w:val="19"/>
                 <w:szCs w:val="19"/>
               </w:rPr>
-              <w:t xml:space="preserve">Problem</w:t>
-            </w:r>
-          </w:p>
-        </w:tc>
-        <w:tc>
-          <w:tcPr>
-            <w:tcW w:type="dxa" w:w="3000"/>
+              <w:t xml:space="preserve">#</w:t>
+            </w:r>
+          </w:p>
+        </w:tc>
+        <w:tc>
+          <w:tcPr>
+            <w:tcW w:type="dxa" w:w="3500"/>
             <w:tcBorders>
               <w:top w:val="single" w:color="CCCCCC" w:sz="1"/>
               <w:left w:val="single" w:color="CCCCCC" w:sz="1"/>
@@ -3338,13 +4544,13 @@
                 <w:sz w:val="19"/>
                 <w:szCs w:val="19"/>
               </w:rPr>
-              <w:t xml:space="preserve">Cause</w:t>
-            </w:r>
-          </w:p>
-        </w:tc>
-        <w:tc>
-          <w:tcPr>
-            <w:tcW w:type="dxa" w:w="3026"/>
+              <w:t xml:space="preserve">File</w:t>
+            </w:r>
+          </w:p>
+        </w:tc>
+        <w:tc>
+          <w:tcPr>
+            <w:tcW w:type="dxa" w:w="5126"/>
             <w:tcBorders>
               <w:top w:val="single" w:color="CCCCCC" w:sz="1"/>
               <w:left w:val="single" w:color="CCCCCC" w:sz="1"/>
@@ -3372,7 +4578,7 @@
                 <w:sz w:val="19"/>
                 <w:szCs w:val="19"/>
               </w:rPr>
-              <w:t xml:space="preserve">Solution</w:t>
+              <w:t xml:space="preserve">Location</w:t>
             </w:r>
           </w:p>
         </w:tc>
@@ -3380,94 +4586,94 @@
       <w:tr>
         <w:tc>
           <w:tcPr>
-            <w:tcW w:type="dxa" w:w="3000"/>
-            <w:tcBorders>
-              <w:top w:val="single" w:color="CCCCCC" w:sz="1"/>
-              <w:left w:val="single" w:color="CCCCCC" w:sz="1"/>
-              <w:bottom w:val="single" w:color="CCCCCC" w:sz="1"/>
-              <w:right w:val="single" w:color="CCCCCC" w:sz="1"/>
-            </w:tcBorders>
-            <w:shd w:fill="FFFFFF" w:val="clear"/>
-            <w:tcMar>
-              <w:top w:type="dxa" w:w="80"/>
-              <w:left w:type="dxa" w:w="120"/>
-              <w:bottom w:type="dxa" w:w="80"/>
-              <w:right w:type="dxa" w:w="120"/>
-            </w:tcMar>
-          </w:tcPr>
-          <w:p>
-            <w:r>
-              <w:rPr>
-                <w:rFonts w:ascii="Arial" w:cs="Arial" w:eastAsia="Arial" w:hAnsi="Arial"/>
-                <w:b w:val="false"/>
-                <w:bCs w:val="false"/>
-                <w:color w:val="000000"/>
-                <w:sz w:val="18"/>
-                <w:szCs w:val="18"/>
-              </w:rPr>
-              <w:t xml:space="preserve">psql command not found in Git Bash</w:t>
-            </w:r>
-          </w:p>
-        </w:tc>
-        <w:tc>
-          <w:tcPr>
-            <w:tcW w:type="dxa" w:w="3000"/>
-            <w:tcBorders>
-              <w:top w:val="single" w:color="CCCCCC" w:sz="1"/>
-              <w:left w:val="single" w:color="CCCCCC" w:sz="1"/>
-              <w:bottom w:val="single" w:color="CCCCCC" w:sz="1"/>
-              <w:right w:val="single" w:color="CCCCCC" w:sz="1"/>
-            </w:tcBorders>
-            <w:shd w:fill="FFFFFF" w:val="clear"/>
-            <w:tcMar>
-              <w:top w:type="dxa" w:w="80"/>
-              <w:left w:type="dxa" w:w="120"/>
-              <w:bottom w:type="dxa" w:w="80"/>
-              <w:right w:type="dxa" w:w="120"/>
-            </w:tcMar>
-          </w:tcPr>
-          <w:p>
-            <w:r>
-              <w:rPr>
-                <w:rFonts w:ascii="Arial" w:cs="Arial" w:eastAsia="Arial" w:hAnsi="Arial"/>
-                <w:b w:val="false"/>
-                <w:bCs w:val="false"/>
-                <w:color w:val="000000"/>
-                <w:sz w:val="18"/>
-                <w:szCs w:val="18"/>
-              </w:rPr>
-              <w:t xml:space="preserve">PostgreSQL bin not in Windows PATH</w:t>
-            </w:r>
-          </w:p>
-        </w:tc>
-        <w:tc>
-          <w:tcPr>
-            <w:tcW w:type="dxa" w:w="3026"/>
-            <w:tcBorders>
-              <w:top w:val="single" w:color="CCCCCC" w:sz="1"/>
-              <w:left w:val="single" w:color="CCCCCC" w:sz="1"/>
-              <w:bottom w:val="single" w:color="CCCCCC" w:sz="1"/>
-              <w:right w:val="single" w:color="CCCCCC" w:sz="1"/>
-            </w:tcBorders>
-            <w:shd w:fill="FFFFFF" w:val="clear"/>
-            <w:tcMar>
-              <w:top w:type="dxa" w:w="80"/>
-              <w:left w:type="dxa" w:w="120"/>
-              <w:bottom w:type="dxa" w:w="80"/>
-              <w:right w:type="dxa" w:w="120"/>
-            </w:tcMar>
-          </w:tcPr>
-          <w:p>
-            <w:r>
-              <w:rPr>
-                <w:rFonts w:ascii="Arial" w:cs="Arial" w:eastAsia="Arial" w:hAnsi="Arial"/>
-                <w:b w:val="false"/>
-                <w:bCs w:val="false"/>
-                <w:color w:val="000000"/>
-                <w:sz w:val="18"/>
-                <w:szCs w:val="18"/>
-              </w:rPr>
-              <w:t xml:space="preserve">Added to ~/.bashrc permanently</w:t>
+            <w:tcW w:type="dxa" w:w="400"/>
+            <w:tcBorders>
+              <w:top w:val="single" w:color="CCCCCC" w:sz="1"/>
+              <w:left w:val="single" w:color="CCCCCC" w:sz="1"/>
+              <w:bottom w:val="single" w:color="CCCCCC" w:sz="1"/>
+              <w:right w:val="single" w:color="CCCCCC" w:sz="1"/>
+            </w:tcBorders>
+            <w:shd w:fill="F2F2F2" w:val="clear"/>
+            <w:tcMar>
+              <w:top w:type="dxa" w:w="80"/>
+              <w:left w:type="dxa" w:w="120"/>
+              <w:bottom w:type="dxa" w:w="80"/>
+              <w:right w:type="dxa" w:w="120"/>
+            </w:tcMar>
+          </w:tcPr>
+          <w:p>
+            <w:r>
+              <w:rPr>
+                <w:rFonts w:ascii="Arial" w:cs="Arial" w:eastAsia="Arial" w:hAnsi="Arial"/>
+                <w:b/>
+                <w:bCs/>
+                <w:color w:val="000000"/>
+                <w:sz w:val="18"/>
+                <w:szCs w:val="18"/>
+              </w:rPr>
+              <w:t xml:space="preserve">1</w:t>
+            </w:r>
+          </w:p>
+        </w:tc>
+        <w:tc>
+          <w:tcPr>
+            <w:tcW w:type="dxa" w:w="3500"/>
+            <w:tcBorders>
+              <w:top w:val="single" w:color="CCCCCC" w:sz="1"/>
+              <w:left w:val="single" w:color="CCCCCC" w:sz="1"/>
+              <w:bottom w:val="single" w:color="CCCCCC" w:sz="1"/>
+              <w:right w:val="single" w:color="CCCCCC" w:sz="1"/>
+            </w:tcBorders>
+            <w:shd w:fill="FFFFFF" w:val="clear"/>
+            <w:tcMar>
+              <w:top w:type="dxa" w:w="80"/>
+              <w:left w:type="dxa" w:w="120"/>
+              <w:bottom w:type="dxa" w:w="80"/>
+              <w:right w:type="dxa" w:w="120"/>
+            </w:tcMar>
+          </w:tcPr>
+          <w:p>
+            <w:r>
+              <w:rPr>
+                <w:rFonts w:ascii="Arial" w:cs="Arial" w:eastAsia="Arial" w:hAnsi="Arial"/>
+                <w:b w:val="false"/>
+                <w:bCs w:val="false"/>
+                <w:color w:val="000000"/>
+                <w:sz w:val="18"/>
+                <w:szCs w:val="18"/>
+              </w:rPr>
+              <w:t xml:space="preserve">week2_architecture_diagram.png</w:t>
+            </w:r>
+          </w:p>
+        </w:tc>
+        <w:tc>
+          <w:tcPr>
+            <w:tcW w:type="dxa" w:w="5126"/>
+            <w:tcBorders>
+              <w:top w:val="single" w:color="CCCCCC" w:sz="1"/>
+              <w:left w:val="single" w:color="CCCCCC" w:sz="1"/>
+              <w:bottom w:val="single" w:color="CCCCCC" w:sz="1"/>
+              <w:right w:val="single" w:color="CCCCCC" w:sz="1"/>
+            </w:tcBorders>
+            <w:shd w:fill="FFFFFF" w:val="clear"/>
+            <w:tcMar>
+              <w:top w:type="dxa" w:w="80"/>
+              <w:left w:type="dxa" w:w="120"/>
+              <w:bottom w:type="dxa" w:w="80"/>
+              <w:right w:type="dxa" w:w="120"/>
+            </w:tcMar>
+          </w:tcPr>
+          <w:p>
+            <w:r>
+              <w:rPr>
+                <w:rFonts w:ascii="Arial" w:cs="Arial" w:eastAsia="Arial" w:hAnsi="Arial"/>
+                <w:b w:val="false"/>
+                <w:bCs w:val="false"/>
+                <w:color w:val="000000"/>
+                <w:sz w:val="18"/>
+                <w:szCs w:val="18"/>
+              </w:rPr>
+              <w:t xml:space="preserve">screenshots_evidence/week2/</w:t>
             </w:r>
           </w:p>
         </w:tc>
@@ -3475,94 +4681,94 @@
       <w:tr>
         <w:tc>
           <w:tcPr>
-            <w:tcW w:type="dxa" w:w="3000"/>
-            <w:tcBorders>
-              <w:top w:val="single" w:color="CCCCCC" w:sz="1"/>
-              <w:left w:val="single" w:color="CCCCCC" w:sz="1"/>
-              <w:bottom w:val="single" w:color="CCCCCC" w:sz="1"/>
-              <w:right w:val="single" w:color="CCCCCC" w:sz="1"/>
-            </w:tcBorders>
-            <w:shd w:fill="FFFFFF" w:val="clear"/>
-            <w:tcMar>
-              <w:top w:type="dxa" w:w="80"/>
-              <w:left w:type="dxa" w:w="120"/>
-              <w:bottom w:type="dxa" w:w="80"/>
-              <w:right w:type="dxa" w:w="120"/>
-            </w:tcMar>
-          </w:tcPr>
-          <w:p>
-            <w:r>
-              <w:rPr>
-                <w:rFonts w:ascii="Arial" w:cs="Arial" w:eastAsia="Arial" w:hAnsi="Arial"/>
-                <w:b w:val="false"/>
-                <w:bCs w:val="false"/>
-                <w:color w:val="000000"/>
-                <w:sz w:val="18"/>
-                <w:szCs w:val="18"/>
-              </w:rPr>
-              <w:t xml:space="preserve">SQL error: cast is reserved word</w:t>
-            </w:r>
-          </w:p>
-        </w:tc>
-        <w:tc>
-          <w:tcPr>
-            <w:tcW w:type="dxa" w:w="3000"/>
-            <w:tcBorders>
-              <w:top w:val="single" w:color="CCCCCC" w:sz="1"/>
-              <w:left w:val="single" w:color="CCCCCC" w:sz="1"/>
-              <w:bottom w:val="single" w:color="CCCCCC" w:sz="1"/>
-              <w:right w:val="single" w:color="CCCCCC" w:sz="1"/>
-            </w:tcBorders>
-            <w:shd w:fill="FFFFFF" w:val="clear"/>
-            <w:tcMar>
-              <w:top w:type="dxa" w:w="80"/>
-              <w:left w:type="dxa" w:w="120"/>
-              <w:bottom w:type="dxa" w:w="80"/>
-              <w:right w:type="dxa" w:w="120"/>
-            </w:tcMar>
-          </w:tcPr>
-          <w:p>
-            <w:r>
-              <w:rPr>
-                <w:rFonts w:ascii="Arial" w:cs="Arial" w:eastAsia="Arial" w:hAnsi="Arial"/>
-                <w:b w:val="false"/>
-                <w:bCs w:val="false"/>
-                <w:color w:val="000000"/>
-                <w:sz w:val="18"/>
-                <w:szCs w:val="18"/>
-              </w:rPr>
-              <w:t xml:space="preserve">cast is a reserved keyword in PostgreSQL</w:t>
-            </w:r>
-          </w:p>
-        </w:tc>
-        <w:tc>
-          <w:tcPr>
-            <w:tcW w:type="dxa" w:w="3026"/>
-            <w:tcBorders>
-              <w:top w:val="single" w:color="CCCCCC" w:sz="1"/>
-              <w:left w:val="single" w:color="CCCCCC" w:sz="1"/>
-              <w:bottom w:val="single" w:color="CCCCCC" w:sz="1"/>
-              <w:right w:val="single" w:color="CCCCCC" w:sz="1"/>
-            </w:tcBorders>
-            <w:shd w:fill="FFFFFF" w:val="clear"/>
-            <w:tcMar>
-              <w:top w:type="dxa" w:w="80"/>
-              <w:left w:type="dxa" w:w="120"/>
-              <w:bottom w:type="dxa" w:w="80"/>
-              <w:right w:type="dxa" w:w="120"/>
-            </w:tcMar>
-          </w:tcPr>
-          <w:p>
-            <w:r>
-              <w:rPr>
-                <w:rFonts w:ascii="Arial" w:cs="Arial" w:eastAsia="Arial" w:hAnsi="Arial"/>
-                <w:b w:val="false"/>
-                <w:bCs w:val="false"/>
-                <w:color w:val="000000"/>
-                <w:sz w:val="18"/>
-                <w:szCs w:val="18"/>
-              </w:rPr>
-              <w:t xml:space="preserve">Renamed to movie_cast in schema</w:t>
+            <w:tcW w:type="dxa" w:w="400"/>
+            <w:tcBorders>
+              <w:top w:val="single" w:color="CCCCCC" w:sz="1"/>
+              <w:left w:val="single" w:color="CCCCCC" w:sz="1"/>
+              <w:bottom w:val="single" w:color="CCCCCC" w:sz="1"/>
+              <w:right w:val="single" w:color="CCCCCC" w:sz="1"/>
+            </w:tcBorders>
+            <w:shd w:fill="F2F2F2" w:val="clear"/>
+            <w:tcMar>
+              <w:top w:type="dxa" w:w="80"/>
+              <w:left w:type="dxa" w:w="120"/>
+              <w:bottom w:type="dxa" w:w="80"/>
+              <w:right w:type="dxa" w:w="120"/>
+            </w:tcMar>
+          </w:tcPr>
+          <w:p>
+            <w:r>
+              <w:rPr>
+                <w:rFonts w:ascii="Arial" w:cs="Arial" w:eastAsia="Arial" w:hAnsi="Arial"/>
+                <w:b/>
+                <w:bCs/>
+                <w:color w:val="000000"/>
+                <w:sz w:val="18"/>
+                <w:szCs w:val="18"/>
+              </w:rPr>
+              <w:t xml:space="preserve">2</w:t>
+            </w:r>
+          </w:p>
+        </w:tc>
+        <w:tc>
+          <w:tcPr>
+            <w:tcW w:type="dxa" w:w="3500"/>
+            <w:tcBorders>
+              <w:top w:val="single" w:color="CCCCCC" w:sz="1"/>
+              <w:left w:val="single" w:color="CCCCCC" w:sz="1"/>
+              <w:bottom w:val="single" w:color="CCCCCC" w:sz="1"/>
+              <w:right w:val="single" w:color="CCCCCC" w:sz="1"/>
+            </w:tcBorders>
+            <w:shd w:fill="FFFFFF" w:val="clear"/>
+            <w:tcMar>
+              <w:top w:type="dxa" w:w="80"/>
+              <w:left w:type="dxa" w:w="120"/>
+              <w:bottom w:type="dxa" w:w="80"/>
+              <w:right w:type="dxa" w:w="120"/>
+            </w:tcMar>
+          </w:tcPr>
+          <w:p>
+            <w:r>
+              <w:rPr>
+                <w:rFonts w:ascii="Arial" w:cs="Arial" w:eastAsia="Arial" w:hAnsi="Arial"/>
+                <w:b w:val="false"/>
+                <w:bCs w:val="false"/>
+                <w:color w:val="000000"/>
+                <w:sz w:val="18"/>
+                <w:szCs w:val="18"/>
+              </w:rPr>
+              <w:t xml:space="preserve">week2_erd_diagram.png</w:t>
+            </w:r>
+          </w:p>
+        </w:tc>
+        <w:tc>
+          <w:tcPr>
+            <w:tcW w:type="dxa" w:w="5126"/>
+            <w:tcBorders>
+              <w:top w:val="single" w:color="CCCCCC" w:sz="1"/>
+              <w:left w:val="single" w:color="CCCCCC" w:sz="1"/>
+              <w:bottom w:val="single" w:color="CCCCCC" w:sz="1"/>
+              <w:right w:val="single" w:color="CCCCCC" w:sz="1"/>
+            </w:tcBorders>
+            <w:shd w:fill="FFFFFF" w:val="clear"/>
+            <w:tcMar>
+              <w:top w:type="dxa" w:w="80"/>
+              <w:left w:type="dxa" w:w="120"/>
+              <w:bottom w:type="dxa" w:w="80"/>
+              <w:right w:type="dxa" w:w="120"/>
+            </w:tcMar>
+          </w:tcPr>
+          <w:p>
+            <w:r>
+              <w:rPr>
+                <w:rFonts w:ascii="Arial" w:cs="Arial" w:eastAsia="Arial" w:hAnsi="Arial"/>
+                <w:b w:val="false"/>
+                <w:bCs w:val="false"/>
+                <w:color w:val="000000"/>
+                <w:sz w:val="18"/>
+                <w:szCs w:val="18"/>
+              </w:rPr>
+              <w:t xml:space="preserve">screenshots_evidence/week2/</w:t>
             </w:r>
           </w:p>
         </w:tc>
@@ -3570,94 +4776,569 @@
       <w:tr>
         <w:tc>
           <w:tcPr>
-            <w:tcW w:type="dxa" w:w="3000"/>
-            <w:tcBorders>
-              <w:top w:val="single" w:color="CCCCCC" w:sz="1"/>
-              <w:left w:val="single" w:color="CCCCCC" w:sz="1"/>
-              <w:bottom w:val="single" w:color="CCCCCC" w:sz="1"/>
-              <w:right w:val="single" w:color="CCCCCC" w:sz="1"/>
-            </w:tcBorders>
-            <w:shd w:fill="FFFFFF" w:val="clear"/>
-            <w:tcMar>
-              <w:top w:type="dxa" w:w="80"/>
-              <w:left w:type="dxa" w:w="120"/>
-              <w:bottom w:type="dxa" w:w="80"/>
-              <w:right w:type="dxa" w:w="120"/>
-            </w:tcMar>
-          </w:tcPr>
-          <w:p>
-            <w:r>
-              <w:rPr>
-                <w:rFonts w:ascii="Arial" w:cs="Arial" w:eastAsia="Arial" w:hAnsi="Arial"/>
-                <w:b w:val="false"/>
-                <w:bCs w:val="false"/>
-                <w:color w:val="000000"/>
-                <w:sz w:val="18"/>
-                <w:szCs w:val="18"/>
-              </w:rPr>
-              <w:t xml:space="preserve">TMDB genre_ids returned integers</w:t>
-            </w:r>
-          </w:p>
-        </w:tc>
-        <w:tc>
-          <w:tcPr>
-            <w:tcW w:type="dxa" w:w="3000"/>
-            <w:tcBorders>
-              <w:top w:val="single" w:color="CCCCCC" w:sz="1"/>
-              <w:left w:val="single" w:color="CCCCCC" w:sz="1"/>
-              <w:bottom w:val="single" w:color="CCCCCC" w:sz="1"/>
-              <w:right w:val="single" w:color="CCCCCC" w:sz="1"/>
-            </w:tcBorders>
-            <w:shd w:fill="FFFFFF" w:val="clear"/>
-            <w:tcMar>
-              <w:top w:type="dxa" w:w="80"/>
-              <w:left w:type="dxa" w:w="120"/>
-              <w:bottom w:type="dxa" w:w="80"/>
-              <w:right w:type="dxa" w:w="120"/>
-            </w:tcMar>
-          </w:tcPr>
-          <w:p>
-            <w:r>
-              <w:rPr>
-                <w:rFonts w:ascii="Arial" w:cs="Arial" w:eastAsia="Arial" w:hAnsi="Arial"/>
-                <w:b w:val="false"/>
-                <w:bCs w:val="false"/>
-                <w:color w:val="000000"/>
-                <w:sz w:val="18"/>
-                <w:szCs w:val="18"/>
-              </w:rPr>
-              <w:t xml:space="preserve">API returns IDs not names by default</w:t>
-            </w:r>
-          </w:p>
-        </w:tc>
-        <w:tc>
-          <w:tcPr>
-            <w:tcW w:type="dxa" w:w="3026"/>
-            <w:tcBorders>
-              <w:top w:val="single" w:color="CCCCCC" w:sz="1"/>
-              <w:left w:val="single" w:color="CCCCCC" w:sz="1"/>
-              <w:bottom w:val="single" w:color="CCCCCC" w:sz="1"/>
-              <w:right w:val="single" w:color="CCCCCC" w:sz="1"/>
-            </w:tcBorders>
-            <w:shd w:fill="FFFFFF" w:val="clear"/>
-            <w:tcMar>
-              <w:top w:type="dxa" w:w="80"/>
-              <w:left w:type="dxa" w:w="120"/>
-              <w:bottom w:type="dxa" w:w="80"/>
-              <w:right w:type="dxa" w:w="120"/>
-            </w:tcMar>
-          </w:tcPr>
-          <w:p>
-            <w:r>
-              <w:rPr>
-                <w:rFonts w:ascii="Arial" w:cs="Arial" w:eastAsia="Arial" w:hAnsi="Arial"/>
-                <w:b w:val="false"/>
-                <w:bCs w:val="false"/>
-                <w:color w:val="000000"/>
-                <w:sz w:val="18"/>
-                <w:szCs w:val="18"/>
-              </w:rPr>
-              <w:t xml:space="preserve">Converted to strings; full names in Week 3</w:t>
+            <w:tcW w:type="dxa" w:w="400"/>
+            <w:tcBorders>
+              <w:top w:val="single" w:color="CCCCCC" w:sz="1"/>
+              <w:left w:val="single" w:color="CCCCCC" w:sz="1"/>
+              <w:bottom w:val="single" w:color="CCCCCC" w:sz="1"/>
+              <w:right w:val="single" w:color="CCCCCC" w:sz="1"/>
+            </w:tcBorders>
+            <w:shd w:fill="F2F2F2" w:val="clear"/>
+            <w:tcMar>
+              <w:top w:type="dxa" w:w="80"/>
+              <w:left w:type="dxa" w:w="120"/>
+              <w:bottom w:type="dxa" w:w="80"/>
+              <w:right w:type="dxa" w:w="120"/>
+            </w:tcMar>
+          </w:tcPr>
+          <w:p>
+            <w:r>
+              <w:rPr>
+                <w:rFonts w:ascii="Arial" w:cs="Arial" w:eastAsia="Arial" w:hAnsi="Arial"/>
+                <w:b/>
+                <w:bCs/>
+                <w:color w:val="000000"/>
+                <w:sz w:val="18"/>
+                <w:szCs w:val="18"/>
+              </w:rPr>
+              <w:t xml:space="preserve">3</w:t>
+            </w:r>
+          </w:p>
+        </w:tc>
+        <w:tc>
+          <w:tcPr>
+            <w:tcW w:type="dxa" w:w="3500"/>
+            <w:tcBorders>
+              <w:top w:val="single" w:color="CCCCCC" w:sz="1"/>
+              <w:left w:val="single" w:color="CCCCCC" w:sz="1"/>
+              <w:bottom w:val="single" w:color="CCCCCC" w:sz="1"/>
+              <w:right w:val="single" w:color="CCCCCC" w:sz="1"/>
+            </w:tcBorders>
+            <w:shd w:fill="FFFFFF" w:val="clear"/>
+            <w:tcMar>
+              <w:top w:type="dxa" w:w="80"/>
+              <w:left w:type="dxa" w:w="120"/>
+              <w:bottom w:type="dxa" w:w="80"/>
+              <w:right w:type="dxa" w:w="120"/>
+            </w:tcMar>
+          </w:tcPr>
+          <w:p>
+            <w:r>
+              <w:rPr>
+                <w:rFonts w:ascii="Arial" w:cs="Arial" w:eastAsia="Arial" w:hAnsi="Arial"/>
+                <w:b w:val="false"/>
+                <w:bCs w:val="false"/>
+                <w:color w:val="000000"/>
+                <w:sz w:val="18"/>
+                <w:szCs w:val="18"/>
+              </w:rPr>
+              <w:t xml:space="preserve">week2_tmdb_results.png</w:t>
+            </w:r>
+          </w:p>
+        </w:tc>
+        <w:tc>
+          <w:tcPr>
+            <w:tcW w:type="dxa" w:w="5126"/>
+            <w:tcBorders>
+              <w:top w:val="single" w:color="CCCCCC" w:sz="1"/>
+              <w:left w:val="single" w:color="CCCCCC" w:sz="1"/>
+              <w:bottom w:val="single" w:color="CCCCCC" w:sz="1"/>
+              <w:right w:val="single" w:color="CCCCCC" w:sz="1"/>
+            </w:tcBorders>
+            <w:shd w:fill="FFFFFF" w:val="clear"/>
+            <w:tcMar>
+              <w:top w:type="dxa" w:w="80"/>
+              <w:left w:type="dxa" w:w="120"/>
+              <w:bottom w:type="dxa" w:w="80"/>
+              <w:right w:type="dxa" w:w="120"/>
+            </w:tcMar>
+          </w:tcPr>
+          <w:p>
+            <w:r>
+              <w:rPr>
+                <w:rFonts w:ascii="Arial" w:cs="Arial" w:eastAsia="Arial" w:hAnsi="Arial"/>
+                <w:b w:val="false"/>
+                <w:bCs w:val="false"/>
+                <w:color w:val="000000"/>
+                <w:sz w:val="18"/>
+                <w:szCs w:val="18"/>
+              </w:rPr>
+              <w:t xml:space="preserve">screenshots_evidence/week2/</w:t>
+            </w:r>
+          </w:p>
+        </w:tc>
+      </w:tr>
+      <w:tr>
+        <w:tc>
+          <w:tcPr>
+            <w:tcW w:type="dxa" w:w="400"/>
+            <w:tcBorders>
+              <w:top w:val="single" w:color="CCCCCC" w:sz="1"/>
+              <w:left w:val="single" w:color="CCCCCC" w:sz="1"/>
+              <w:bottom w:val="single" w:color="CCCCCC" w:sz="1"/>
+              <w:right w:val="single" w:color="CCCCCC" w:sz="1"/>
+            </w:tcBorders>
+            <w:shd w:fill="F2F2F2" w:val="clear"/>
+            <w:tcMar>
+              <w:top w:type="dxa" w:w="80"/>
+              <w:left w:type="dxa" w:w="120"/>
+              <w:bottom w:type="dxa" w:w="80"/>
+              <w:right w:type="dxa" w:w="120"/>
+            </w:tcMar>
+          </w:tcPr>
+          <w:p>
+            <w:r>
+              <w:rPr>
+                <w:rFonts w:ascii="Arial" w:cs="Arial" w:eastAsia="Arial" w:hAnsi="Arial"/>
+                <w:b/>
+                <w:bCs/>
+                <w:color w:val="000000"/>
+                <w:sz w:val="18"/>
+                <w:szCs w:val="18"/>
+              </w:rPr>
+              <w:t xml:space="preserve">4</w:t>
+            </w:r>
+          </w:p>
+        </w:tc>
+        <w:tc>
+          <w:tcPr>
+            <w:tcW w:type="dxa" w:w="3500"/>
+            <w:tcBorders>
+              <w:top w:val="single" w:color="CCCCCC" w:sz="1"/>
+              <w:left w:val="single" w:color="CCCCCC" w:sz="1"/>
+              <w:bottom w:val="single" w:color="CCCCCC" w:sz="1"/>
+              <w:right w:val="single" w:color="CCCCCC" w:sz="1"/>
+            </w:tcBorders>
+            <w:shd w:fill="FFFFFF" w:val="clear"/>
+            <w:tcMar>
+              <w:top w:type="dxa" w:w="80"/>
+              <w:left w:type="dxa" w:w="120"/>
+              <w:bottom w:type="dxa" w:w="80"/>
+              <w:right w:type="dxa" w:w="120"/>
+            </w:tcMar>
+          </w:tcPr>
+          <w:p>
+            <w:r>
+              <w:rPr>
+                <w:rFonts w:ascii="Arial" w:cs="Arial" w:eastAsia="Arial" w:hAnsi="Arial"/>
+                <w:b w:val="false"/>
+                <w:bCs w:val="false"/>
+                <w:color w:val="000000"/>
+                <w:sz w:val="18"/>
+                <w:szCs w:val="18"/>
+              </w:rPr>
+              <w:t xml:space="preserve">week2_database_tables.png</w:t>
+            </w:r>
+          </w:p>
+        </w:tc>
+        <w:tc>
+          <w:tcPr>
+            <w:tcW w:type="dxa" w:w="5126"/>
+            <w:tcBorders>
+              <w:top w:val="single" w:color="CCCCCC" w:sz="1"/>
+              <w:left w:val="single" w:color="CCCCCC" w:sz="1"/>
+              <w:bottom w:val="single" w:color="CCCCCC" w:sz="1"/>
+              <w:right w:val="single" w:color="CCCCCC" w:sz="1"/>
+            </w:tcBorders>
+            <w:shd w:fill="FFFFFF" w:val="clear"/>
+            <w:tcMar>
+              <w:top w:type="dxa" w:w="80"/>
+              <w:left w:type="dxa" w:w="120"/>
+              <w:bottom w:type="dxa" w:w="80"/>
+              <w:right w:type="dxa" w:w="120"/>
+            </w:tcMar>
+          </w:tcPr>
+          <w:p>
+            <w:r>
+              <w:rPr>
+                <w:rFonts w:ascii="Arial" w:cs="Arial" w:eastAsia="Arial" w:hAnsi="Arial"/>
+                <w:b w:val="false"/>
+                <w:bCs w:val="false"/>
+                <w:color w:val="000000"/>
+                <w:sz w:val="18"/>
+                <w:szCs w:val="18"/>
+              </w:rPr>
+              <w:t xml:space="preserve">screenshots_evidence/week2/</w:t>
+            </w:r>
+          </w:p>
+        </w:tc>
+      </w:tr>
+      <w:tr>
+        <w:tc>
+          <w:tcPr>
+            <w:tcW w:type="dxa" w:w="400"/>
+            <w:tcBorders>
+              <w:top w:val="single" w:color="CCCCCC" w:sz="1"/>
+              <w:left w:val="single" w:color="CCCCCC" w:sz="1"/>
+              <w:bottom w:val="single" w:color="CCCCCC" w:sz="1"/>
+              <w:right w:val="single" w:color="CCCCCC" w:sz="1"/>
+            </w:tcBorders>
+            <w:shd w:fill="F2F2F2" w:val="clear"/>
+            <w:tcMar>
+              <w:top w:type="dxa" w:w="80"/>
+              <w:left w:type="dxa" w:w="120"/>
+              <w:bottom w:type="dxa" w:w="80"/>
+              <w:right w:type="dxa" w:w="120"/>
+            </w:tcMar>
+          </w:tcPr>
+          <w:p>
+            <w:r>
+              <w:rPr>
+                <w:rFonts w:ascii="Arial" w:cs="Arial" w:eastAsia="Arial" w:hAnsi="Arial"/>
+                <w:b/>
+                <w:bCs/>
+                <w:color w:val="000000"/>
+                <w:sz w:val="18"/>
+                <w:szCs w:val="18"/>
+              </w:rPr>
+              <w:t xml:space="preserve">5</w:t>
+            </w:r>
+          </w:p>
+        </w:tc>
+        <w:tc>
+          <w:tcPr>
+            <w:tcW w:type="dxa" w:w="3500"/>
+            <w:tcBorders>
+              <w:top w:val="single" w:color="CCCCCC" w:sz="1"/>
+              <w:left w:val="single" w:color="CCCCCC" w:sz="1"/>
+              <w:bottom w:val="single" w:color="CCCCCC" w:sz="1"/>
+              <w:right w:val="single" w:color="CCCCCC" w:sz="1"/>
+            </w:tcBorders>
+            <w:shd w:fill="FFFFFF" w:val="clear"/>
+            <w:tcMar>
+              <w:top w:type="dxa" w:w="80"/>
+              <w:left w:type="dxa" w:w="120"/>
+              <w:bottom w:type="dxa" w:w="80"/>
+              <w:right w:type="dxa" w:w="120"/>
+            </w:tcMar>
+          </w:tcPr>
+          <w:p>
+            <w:r>
+              <w:rPr>
+                <w:rFonts w:ascii="Arial" w:cs="Arial" w:eastAsia="Arial" w:hAnsi="Arial"/>
+                <w:b w:val="false"/>
+                <w:bCs w:val="false"/>
+                <w:color w:val="000000"/>
+                <w:sz w:val="18"/>
+                <w:szCs w:val="18"/>
+              </w:rPr>
+              <w:t xml:space="preserve">week2_unit_tests_passing.png</w:t>
+            </w:r>
+          </w:p>
+        </w:tc>
+        <w:tc>
+          <w:tcPr>
+            <w:tcW w:type="dxa" w:w="5126"/>
+            <w:tcBorders>
+              <w:top w:val="single" w:color="CCCCCC" w:sz="1"/>
+              <w:left w:val="single" w:color="CCCCCC" w:sz="1"/>
+              <w:bottom w:val="single" w:color="CCCCCC" w:sz="1"/>
+              <w:right w:val="single" w:color="CCCCCC" w:sz="1"/>
+            </w:tcBorders>
+            <w:shd w:fill="FFFFFF" w:val="clear"/>
+            <w:tcMar>
+              <w:top w:type="dxa" w:w="80"/>
+              <w:left w:type="dxa" w:w="120"/>
+              <w:bottom w:type="dxa" w:w="80"/>
+              <w:right w:type="dxa" w:w="120"/>
+            </w:tcMar>
+          </w:tcPr>
+          <w:p>
+            <w:r>
+              <w:rPr>
+                <w:rFonts w:ascii="Arial" w:cs="Arial" w:eastAsia="Arial" w:hAnsi="Arial"/>
+                <w:b w:val="false"/>
+                <w:bCs w:val="false"/>
+                <w:color w:val="000000"/>
+                <w:sz w:val="18"/>
+                <w:szCs w:val="18"/>
+              </w:rPr>
+              <w:t xml:space="preserve">screenshots_evidence/week2/</w:t>
+            </w:r>
+          </w:p>
+        </w:tc>
+      </w:tr>
+      <w:tr>
+        <w:tc>
+          <w:tcPr>
+            <w:tcW w:type="dxa" w:w="400"/>
+            <w:tcBorders>
+              <w:top w:val="single" w:color="CCCCCC" w:sz="1"/>
+              <w:left w:val="single" w:color="CCCCCC" w:sz="1"/>
+              <w:bottom w:val="single" w:color="CCCCCC" w:sz="1"/>
+              <w:right w:val="single" w:color="CCCCCC" w:sz="1"/>
+            </w:tcBorders>
+            <w:shd w:fill="F2F2F2" w:val="clear"/>
+            <w:tcMar>
+              <w:top w:type="dxa" w:w="80"/>
+              <w:left w:type="dxa" w:w="120"/>
+              <w:bottom w:type="dxa" w:w="80"/>
+              <w:right w:type="dxa" w:w="120"/>
+            </w:tcMar>
+          </w:tcPr>
+          <w:p>
+            <w:r>
+              <w:rPr>
+                <w:rFonts w:ascii="Arial" w:cs="Arial" w:eastAsia="Arial" w:hAnsi="Arial"/>
+                <w:b/>
+                <w:bCs/>
+                <w:color w:val="000000"/>
+                <w:sz w:val="18"/>
+                <w:szCs w:val="18"/>
+              </w:rPr>
+              <w:t xml:space="preserve">6</w:t>
+            </w:r>
+          </w:p>
+        </w:tc>
+        <w:tc>
+          <w:tcPr>
+            <w:tcW w:type="dxa" w:w="3500"/>
+            <w:tcBorders>
+              <w:top w:val="single" w:color="CCCCCC" w:sz="1"/>
+              <w:left w:val="single" w:color="CCCCCC" w:sz="1"/>
+              <w:bottom w:val="single" w:color="CCCCCC" w:sz="1"/>
+              <w:right w:val="single" w:color="CCCCCC" w:sz="1"/>
+            </w:tcBorders>
+            <w:shd w:fill="FFFFFF" w:val="clear"/>
+            <w:tcMar>
+              <w:top w:type="dxa" w:w="80"/>
+              <w:left w:type="dxa" w:w="120"/>
+              <w:bottom w:type="dxa" w:w="80"/>
+              <w:right w:type="dxa" w:w="120"/>
+            </w:tcMar>
+          </w:tcPr>
+          <w:p>
+            <w:r>
+              <w:rPr>
+                <w:rFonts w:ascii="Arial" w:cs="Arial" w:eastAsia="Arial" w:hAnsi="Arial"/>
+                <w:b w:val="false"/>
+                <w:bCs w:val="false"/>
+                <w:color w:val="000000"/>
+                <w:sz w:val="18"/>
+                <w:szCs w:val="18"/>
+              </w:rPr>
+              <w:t xml:space="preserve">Week2_Architecture_and_ERD.docx</w:t>
+            </w:r>
+          </w:p>
+        </w:tc>
+        <w:tc>
+          <w:tcPr>
+            <w:tcW w:type="dxa" w:w="5126"/>
+            <w:tcBorders>
+              <w:top w:val="single" w:color="CCCCCC" w:sz="1"/>
+              <w:left w:val="single" w:color="CCCCCC" w:sz="1"/>
+              <w:bottom w:val="single" w:color="CCCCCC" w:sz="1"/>
+              <w:right w:val="single" w:color="CCCCCC" w:sz="1"/>
+            </w:tcBorders>
+            <w:shd w:fill="FFFFFF" w:val="clear"/>
+            <w:tcMar>
+              <w:top w:type="dxa" w:w="80"/>
+              <w:left w:type="dxa" w:w="120"/>
+              <w:bottom w:type="dxa" w:w="80"/>
+              <w:right w:type="dxa" w:w="120"/>
+            </w:tcMar>
+          </w:tcPr>
+          <w:p>
+            <w:r>
+              <w:rPr>
+                <w:rFonts w:ascii="Arial" w:cs="Arial" w:eastAsia="Arial" w:hAnsi="Arial"/>
+                <w:b w:val="false"/>
+                <w:bCs w:val="false"/>
+                <w:color w:val="000000"/>
+                <w:sz w:val="18"/>
+                <w:szCs w:val="18"/>
+              </w:rPr>
+              <w:t xml:space="preserve">docs/</w:t>
+            </w:r>
+          </w:p>
+        </w:tc>
+      </w:tr>
+      <w:tr>
+        <w:tc>
+          <w:tcPr>
+            <w:tcW w:type="dxa" w:w="400"/>
+            <w:tcBorders>
+              <w:top w:val="single" w:color="CCCCCC" w:sz="1"/>
+              <w:left w:val="single" w:color="CCCCCC" w:sz="1"/>
+              <w:bottom w:val="single" w:color="CCCCCC" w:sz="1"/>
+              <w:right w:val="single" w:color="CCCCCC" w:sz="1"/>
+            </w:tcBorders>
+            <w:shd w:fill="F2F2F2" w:val="clear"/>
+            <w:tcMar>
+              <w:top w:type="dxa" w:w="80"/>
+              <w:left w:type="dxa" w:w="120"/>
+              <w:bottom w:type="dxa" w:w="80"/>
+              <w:right w:type="dxa" w:w="120"/>
+            </w:tcMar>
+          </w:tcPr>
+          <w:p>
+            <w:r>
+              <w:rPr>
+                <w:rFonts w:ascii="Arial" w:cs="Arial" w:eastAsia="Arial" w:hAnsi="Arial"/>
+                <w:b/>
+                <w:bCs/>
+                <w:color w:val="000000"/>
+                <w:sz w:val="18"/>
+                <w:szCs w:val="18"/>
+              </w:rPr>
+              <w:t xml:space="preserve">7</w:t>
+            </w:r>
+          </w:p>
+        </w:tc>
+        <w:tc>
+          <w:tcPr>
+            <w:tcW w:type="dxa" w:w="3500"/>
+            <w:tcBorders>
+              <w:top w:val="single" w:color="CCCCCC" w:sz="1"/>
+              <w:left w:val="single" w:color="CCCCCC" w:sz="1"/>
+              <w:bottom w:val="single" w:color="CCCCCC" w:sz="1"/>
+              <w:right w:val="single" w:color="CCCCCC" w:sz="1"/>
+            </w:tcBorders>
+            <w:shd w:fill="FFFFFF" w:val="clear"/>
+            <w:tcMar>
+              <w:top w:type="dxa" w:w="80"/>
+              <w:left w:type="dxa" w:w="120"/>
+              <w:bottom w:type="dxa" w:w="80"/>
+              <w:right w:type="dxa" w:w="120"/>
+            </w:tcMar>
+          </w:tcPr>
+          <w:p>
+            <w:r>
+              <w:rPr>
+                <w:rFonts w:ascii="Arial" w:cs="Arial" w:eastAsia="Arial" w:hAnsi="Arial"/>
+                <w:b w:val="false"/>
+                <w:bCs w:val="false"/>
+                <w:color w:val="000000"/>
+                <w:sz w:val="18"/>
+                <w:szCs w:val="18"/>
+              </w:rPr>
+              <w:t xml:space="preserve">movies_enriched.csv</w:t>
+            </w:r>
+          </w:p>
+        </w:tc>
+        <w:tc>
+          <w:tcPr>
+            <w:tcW w:type="dxa" w:w="5126"/>
+            <w:tcBorders>
+              <w:top w:val="single" w:color="CCCCCC" w:sz="1"/>
+              <w:left w:val="single" w:color="CCCCCC" w:sz="1"/>
+              <w:bottom w:val="single" w:color="CCCCCC" w:sz="1"/>
+              <w:right w:val="single" w:color="CCCCCC" w:sz="1"/>
+            </w:tcBorders>
+            <w:shd w:fill="FFFFFF" w:val="clear"/>
+            <w:tcMar>
+              <w:top w:type="dxa" w:w="80"/>
+              <w:left w:type="dxa" w:w="120"/>
+              <w:bottom w:type="dxa" w:w="80"/>
+              <w:right w:type="dxa" w:w="120"/>
+            </w:tcMar>
+          </w:tcPr>
+          <w:p>
+            <w:r>
+              <w:rPr>
+                <w:rFonts w:ascii="Arial" w:cs="Arial" w:eastAsia="Arial" w:hAnsi="Arial"/>
+                <w:b w:val="false"/>
+                <w:bCs w:val="false"/>
+                <w:color w:val="000000"/>
+                <w:sz w:val="18"/>
+                <w:szCs w:val="18"/>
+              </w:rPr>
+              <w:t xml:space="preserve">dataset/enriched/</w:t>
+            </w:r>
+          </w:p>
+        </w:tc>
+      </w:tr>
+      <w:tr>
+        <w:tc>
+          <w:tcPr>
+            <w:tcW w:type="dxa" w:w="400"/>
+            <w:tcBorders>
+              <w:top w:val="single" w:color="CCCCCC" w:sz="1"/>
+              <w:left w:val="single" w:color="CCCCCC" w:sz="1"/>
+              <w:bottom w:val="single" w:color="CCCCCC" w:sz="1"/>
+              <w:right w:val="single" w:color="CCCCCC" w:sz="1"/>
+            </w:tcBorders>
+            <w:shd w:fill="F2F2F2" w:val="clear"/>
+            <w:tcMar>
+              <w:top w:type="dxa" w:w="80"/>
+              <w:left w:type="dxa" w:w="120"/>
+              <w:bottom w:type="dxa" w:w="80"/>
+              <w:right w:type="dxa" w:w="120"/>
+            </w:tcMar>
+          </w:tcPr>
+          <w:p>
+            <w:r>
+              <w:rPr>
+                <w:rFonts w:ascii="Arial" w:cs="Arial" w:eastAsia="Arial" w:hAnsi="Arial"/>
+                <w:b/>
+                <w:bCs/>
+                <w:color w:val="000000"/>
+                <w:sz w:val="18"/>
+                <w:szCs w:val="18"/>
+              </w:rPr>
+              <w:t xml:space="preserve">8</w:t>
+            </w:r>
+          </w:p>
+        </w:tc>
+        <w:tc>
+          <w:tcPr>
+            <w:tcW w:type="dxa" w:w="3500"/>
+            <w:tcBorders>
+              <w:top w:val="single" w:color="CCCCCC" w:sz="1"/>
+              <w:left w:val="single" w:color="CCCCCC" w:sz="1"/>
+              <w:bottom w:val="single" w:color="CCCCCC" w:sz="1"/>
+              <w:right w:val="single" w:color="CCCCCC" w:sz="1"/>
+            </w:tcBorders>
+            <w:shd w:fill="FFFFFF" w:val="clear"/>
+            <w:tcMar>
+              <w:top w:type="dxa" w:w="80"/>
+              <w:left w:type="dxa" w:w="120"/>
+              <w:bottom w:type="dxa" w:w="80"/>
+              <w:right w:type="dxa" w:w="120"/>
+            </w:tcMar>
+          </w:tcPr>
+          <w:p>
+            <w:r>
+              <w:rPr>
+                <w:rFonts w:ascii="Arial" w:cs="Arial" w:eastAsia="Arial" w:hAnsi="Arial"/>
+                <w:b w:val="false"/>
+                <w:bCs w:val="false"/>
+                <w:color w:val="000000"/>
+                <w:sz w:val="18"/>
+                <w:szCs w:val="18"/>
+              </w:rPr>
+              <w:t xml:space="preserve">create_tables.sql</w:t>
+            </w:r>
+          </w:p>
+        </w:tc>
+        <w:tc>
+          <w:tcPr>
+            <w:tcW w:type="dxa" w:w="5126"/>
+            <w:tcBorders>
+              <w:top w:val="single" w:color="CCCCCC" w:sz="1"/>
+              <w:left w:val="single" w:color="CCCCCC" w:sz="1"/>
+              <w:bottom w:val="single" w:color="CCCCCC" w:sz="1"/>
+              <w:right w:val="single" w:color="CCCCCC" w:sz="1"/>
+            </w:tcBorders>
+            <w:shd w:fill="FFFFFF" w:val="clear"/>
+            <w:tcMar>
+              <w:top w:type="dxa" w:w="80"/>
+              <w:left w:type="dxa" w:w="120"/>
+              <w:bottom w:type="dxa" w:w="80"/>
+              <w:right w:type="dxa" w:w="120"/>
+            </w:tcMar>
+          </w:tcPr>
+          <w:p>
+            <w:r>
+              <w:rPr>
+                <w:rFonts w:ascii="Arial" w:cs="Arial" w:eastAsia="Arial" w:hAnsi="Arial"/>
+                <w:b w:val="false"/>
+                <w:bCs w:val="false"/>
+                <w:color w:val="000000"/>
+                <w:sz w:val="18"/>
+                <w:szCs w:val="18"/>
+              </w:rPr>
+              <w:t xml:space="preserve">backend/data/</w:t>
             </w:r>
           </w:p>
         </w:tc>
@@ -3687,7 +5368,536 @@
           <w:sz w:val="26"/>
           <w:szCs w:val="26"/>
         </w:rPr>
-        <w:t xml:space="preserve">6. Week 3 Plan — 29 June to 5 July 2026</w:t>
+        <w:t xml:space="preserve">7. Problems Faced &amp; Solutions</w:t>
+      </w:r>
+    </w:p>
+    <w:tbl>
+      <w:tblPr>
+        <w:tblW w:type="dxa" w:w="9026"/>
+        <w:tblBorders>
+          <w:top w:val="single" w:color="auto" w:sz="4"/>
+          <w:left w:val="single" w:color="auto" w:sz="4"/>
+          <w:bottom w:val="single" w:color="auto" w:sz="4"/>
+          <w:right w:val="single" w:color="auto" w:sz="4"/>
+          <w:insideH w:val="single" w:color="auto" w:sz="4"/>
+          <w:insideV w:val="single" w:color="auto" w:sz="4"/>
+        </w:tblBorders>
+      </w:tblPr>
+      <w:tblGrid>
+        <w:gridCol w:w="2800"/>
+        <w:gridCol w:w="2800"/>
+        <w:gridCol w:w="3426"/>
+      </w:tblGrid>
+      <w:tr>
+        <w:tc>
+          <w:tcPr>
+            <w:tcW w:type="dxa" w:w="2800"/>
+            <w:tcBorders>
+              <w:top w:val="single" w:color="CCCCCC" w:sz="1"/>
+              <w:left w:val="single" w:color="CCCCCC" w:sz="1"/>
+              <w:bottom w:val="single" w:color="CCCCCC" w:sz="1"/>
+              <w:right w:val="single" w:color="CCCCCC" w:sz="1"/>
+            </w:tcBorders>
+            <w:shd w:fill="1F3864" w:val="clear"/>
+            <w:tcMar>
+              <w:top w:type="dxa" w:w="80"/>
+              <w:left w:type="dxa" w:w="120"/>
+              <w:bottom w:type="dxa" w:w="80"/>
+              <w:right w:type="dxa" w:w="120"/>
+            </w:tcMar>
+          </w:tcPr>
+          <w:p>
+            <w:pPr>
+              <w:jc w:val="center"/>
+            </w:pPr>
+            <w:r>
+              <w:rPr>
+                <w:rFonts w:ascii="Arial" w:cs="Arial" w:eastAsia="Arial" w:hAnsi="Arial"/>
+                <w:b/>
+                <w:bCs/>
+                <w:color w:val="FFFFFF"/>
+                <w:sz w:val="19"/>
+                <w:szCs w:val="19"/>
+              </w:rPr>
+              <w:t xml:space="preserve">Problem</w:t>
+            </w:r>
+          </w:p>
+        </w:tc>
+        <w:tc>
+          <w:tcPr>
+            <w:tcW w:type="dxa" w:w="2800"/>
+            <w:tcBorders>
+              <w:top w:val="single" w:color="CCCCCC" w:sz="1"/>
+              <w:left w:val="single" w:color="CCCCCC" w:sz="1"/>
+              <w:bottom w:val="single" w:color="CCCCCC" w:sz="1"/>
+              <w:right w:val="single" w:color="CCCCCC" w:sz="1"/>
+            </w:tcBorders>
+            <w:shd w:fill="1F3864" w:val="clear"/>
+            <w:tcMar>
+              <w:top w:type="dxa" w:w="80"/>
+              <w:left w:type="dxa" w:w="120"/>
+              <w:bottom w:type="dxa" w:w="80"/>
+              <w:right w:type="dxa" w:w="120"/>
+            </w:tcMar>
+          </w:tcPr>
+          <w:p>
+            <w:pPr>
+              <w:jc w:val="center"/>
+            </w:pPr>
+            <w:r>
+              <w:rPr>
+                <w:rFonts w:ascii="Arial" w:cs="Arial" w:eastAsia="Arial" w:hAnsi="Arial"/>
+                <w:b/>
+                <w:bCs/>
+                <w:color w:val="FFFFFF"/>
+                <w:sz w:val="19"/>
+                <w:szCs w:val="19"/>
+              </w:rPr>
+              <w:t xml:space="preserve">Cause</w:t>
+            </w:r>
+          </w:p>
+        </w:tc>
+        <w:tc>
+          <w:tcPr>
+            <w:tcW w:type="dxa" w:w="3426"/>
+            <w:tcBorders>
+              <w:top w:val="single" w:color="CCCCCC" w:sz="1"/>
+              <w:left w:val="single" w:color="CCCCCC" w:sz="1"/>
+              <w:bottom w:val="single" w:color="CCCCCC" w:sz="1"/>
+              <w:right w:val="single" w:color="CCCCCC" w:sz="1"/>
+            </w:tcBorders>
+            <w:shd w:fill="1F3864" w:val="clear"/>
+            <w:tcMar>
+              <w:top w:type="dxa" w:w="80"/>
+              <w:left w:type="dxa" w:w="120"/>
+              <w:bottom w:type="dxa" w:w="80"/>
+              <w:right w:type="dxa" w:w="120"/>
+            </w:tcMar>
+          </w:tcPr>
+          <w:p>
+            <w:pPr>
+              <w:jc w:val="center"/>
+            </w:pPr>
+            <w:r>
+              <w:rPr>
+                <w:rFonts w:ascii="Arial" w:cs="Arial" w:eastAsia="Arial" w:hAnsi="Arial"/>
+                <w:b/>
+                <w:bCs/>
+                <w:color w:val="FFFFFF"/>
+                <w:sz w:val="19"/>
+                <w:szCs w:val="19"/>
+              </w:rPr>
+              <w:t xml:space="preserve">Solution</w:t>
+            </w:r>
+          </w:p>
+        </w:tc>
+      </w:tr>
+      <w:tr>
+        <w:tc>
+          <w:tcPr>
+            <w:tcW w:type="dxa" w:w="2800"/>
+            <w:tcBorders>
+              <w:top w:val="single" w:color="CCCCCC" w:sz="1"/>
+              <w:left w:val="single" w:color="CCCCCC" w:sz="1"/>
+              <w:bottom w:val="single" w:color="CCCCCC" w:sz="1"/>
+              <w:right w:val="single" w:color="CCCCCC" w:sz="1"/>
+            </w:tcBorders>
+            <w:shd w:fill="FFFFFF" w:val="clear"/>
+            <w:tcMar>
+              <w:top w:type="dxa" w:w="80"/>
+              <w:left w:type="dxa" w:w="120"/>
+              <w:bottom w:type="dxa" w:w="80"/>
+              <w:right w:type="dxa" w:w="120"/>
+            </w:tcMar>
+          </w:tcPr>
+          <w:p>
+            <w:r>
+              <w:rPr>
+                <w:rFonts w:ascii="Arial" w:cs="Arial" w:eastAsia="Arial" w:hAnsi="Arial"/>
+                <w:b w:val="false"/>
+                <w:bCs w:val="false"/>
+                <w:color w:val="000000"/>
+                <w:sz w:val="18"/>
+                <w:szCs w:val="18"/>
+              </w:rPr>
+              <w:t xml:space="preserve">psql not found in Git Bash</w:t>
+            </w:r>
+          </w:p>
+        </w:tc>
+        <w:tc>
+          <w:tcPr>
+            <w:tcW w:type="dxa" w:w="2800"/>
+            <w:tcBorders>
+              <w:top w:val="single" w:color="CCCCCC" w:sz="1"/>
+              <w:left w:val="single" w:color="CCCCCC" w:sz="1"/>
+              <w:bottom w:val="single" w:color="CCCCCC" w:sz="1"/>
+              <w:right w:val="single" w:color="CCCCCC" w:sz="1"/>
+            </w:tcBorders>
+            <w:shd w:fill="FFFFFF" w:val="clear"/>
+            <w:tcMar>
+              <w:top w:type="dxa" w:w="80"/>
+              <w:left w:type="dxa" w:w="120"/>
+              <w:bottom w:type="dxa" w:w="80"/>
+              <w:right w:type="dxa" w:w="120"/>
+            </w:tcMar>
+          </w:tcPr>
+          <w:p>
+            <w:r>
+              <w:rPr>
+                <w:rFonts w:ascii="Arial" w:cs="Arial" w:eastAsia="Arial" w:hAnsi="Arial"/>
+                <w:b w:val="false"/>
+                <w:bCs w:val="false"/>
+                <w:color w:val="000000"/>
+                <w:sz w:val="18"/>
+                <w:szCs w:val="18"/>
+              </w:rPr>
+              <w:t xml:space="preserve">PostgreSQL bin not in Windows PATH</w:t>
+            </w:r>
+          </w:p>
+        </w:tc>
+        <w:tc>
+          <w:tcPr>
+            <w:tcW w:type="dxa" w:w="3426"/>
+            <w:tcBorders>
+              <w:top w:val="single" w:color="CCCCCC" w:sz="1"/>
+              <w:left w:val="single" w:color="CCCCCC" w:sz="1"/>
+              <w:bottom w:val="single" w:color="CCCCCC" w:sz="1"/>
+              <w:right w:val="single" w:color="CCCCCC" w:sz="1"/>
+            </w:tcBorders>
+            <w:shd w:fill="FFFFFF" w:val="clear"/>
+            <w:tcMar>
+              <w:top w:type="dxa" w:w="80"/>
+              <w:left w:type="dxa" w:w="120"/>
+              <w:bottom w:type="dxa" w:w="80"/>
+              <w:right w:type="dxa" w:w="120"/>
+            </w:tcMar>
+          </w:tcPr>
+          <w:p>
+            <w:r>
+              <w:rPr>
+                <w:rFonts w:ascii="Arial" w:cs="Arial" w:eastAsia="Arial" w:hAnsi="Arial"/>
+                <w:b w:val="false"/>
+                <w:bCs w:val="false"/>
+                <w:color w:val="000000"/>
+                <w:sz w:val="18"/>
+                <w:szCs w:val="18"/>
+              </w:rPr>
+              <w:t xml:space="preserve">Added permanently to ~/.bashrc</w:t>
+            </w:r>
+          </w:p>
+        </w:tc>
+      </w:tr>
+      <w:tr>
+        <w:tc>
+          <w:tcPr>
+            <w:tcW w:type="dxa" w:w="2800"/>
+            <w:tcBorders>
+              <w:top w:val="single" w:color="CCCCCC" w:sz="1"/>
+              <w:left w:val="single" w:color="CCCCCC" w:sz="1"/>
+              <w:bottom w:val="single" w:color="CCCCCC" w:sz="1"/>
+              <w:right w:val="single" w:color="CCCCCC" w:sz="1"/>
+            </w:tcBorders>
+            <w:shd w:fill="FFFFFF" w:val="clear"/>
+            <w:tcMar>
+              <w:top w:type="dxa" w:w="80"/>
+              <w:left w:type="dxa" w:w="120"/>
+              <w:bottom w:type="dxa" w:w="80"/>
+              <w:right w:type="dxa" w:w="120"/>
+            </w:tcMar>
+          </w:tcPr>
+          <w:p>
+            <w:r>
+              <w:rPr>
+                <w:rFonts w:ascii="Arial" w:cs="Arial" w:eastAsia="Arial" w:hAnsi="Arial"/>
+                <w:b w:val="false"/>
+                <w:bCs w:val="false"/>
+                <w:color w:val="000000"/>
+                <w:sz w:val="18"/>
+                <w:szCs w:val="18"/>
+              </w:rPr>
+              <w:t xml:space="preserve">SQL error: cast is reserved word</w:t>
+            </w:r>
+          </w:p>
+        </w:tc>
+        <w:tc>
+          <w:tcPr>
+            <w:tcW w:type="dxa" w:w="2800"/>
+            <w:tcBorders>
+              <w:top w:val="single" w:color="CCCCCC" w:sz="1"/>
+              <w:left w:val="single" w:color="CCCCCC" w:sz="1"/>
+              <w:bottom w:val="single" w:color="CCCCCC" w:sz="1"/>
+              <w:right w:val="single" w:color="CCCCCC" w:sz="1"/>
+            </w:tcBorders>
+            <w:shd w:fill="FFFFFF" w:val="clear"/>
+            <w:tcMar>
+              <w:top w:type="dxa" w:w="80"/>
+              <w:left w:type="dxa" w:w="120"/>
+              <w:bottom w:type="dxa" w:w="80"/>
+              <w:right w:type="dxa" w:w="120"/>
+            </w:tcMar>
+          </w:tcPr>
+          <w:p>
+            <w:r>
+              <w:rPr>
+                <w:rFonts w:ascii="Arial" w:cs="Arial" w:eastAsia="Arial" w:hAnsi="Arial"/>
+                <w:b w:val="false"/>
+                <w:bCs w:val="false"/>
+                <w:color w:val="000000"/>
+                <w:sz w:val="18"/>
+                <w:szCs w:val="18"/>
+              </w:rPr>
+              <w:t xml:space="preserve">cast is PostgreSQL keyword</w:t>
+            </w:r>
+          </w:p>
+        </w:tc>
+        <w:tc>
+          <w:tcPr>
+            <w:tcW w:type="dxa" w:w="3426"/>
+            <w:tcBorders>
+              <w:top w:val="single" w:color="CCCCCC" w:sz="1"/>
+              <w:left w:val="single" w:color="CCCCCC" w:sz="1"/>
+              <w:bottom w:val="single" w:color="CCCCCC" w:sz="1"/>
+              <w:right w:val="single" w:color="CCCCCC" w:sz="1"/>
+            </w:tcBorders>
+            <w:shd w:fill="FFFFFF" w:val="clear"/>
+            <w:tcMar>
+              <w:top w:type="dxa" w:w="80"/>
+              <w:left w:type="dxa" w:w="120"/>
+              <w:bottom w:type="dxa" w:w="80"/>
+              <w:right w:type="dxa" w:w="120"/>
+            </w:tcMar>
+          </w:tcPr>
+          <w:p>
+            <w:r>
+              <w:rPr>
+                <w:rFonts w:ascii="Arial" w:cs="Arial" w:eastAsia="Arial" w:hAnsi="Arial"/>
+                <w:b w:val="false"/>
+                <w:bCs w:val="false"/>
+                <w:color w:val="000000"/>
+                <w:sz w:val="18"/>
+                <w:szCs w:val="18"/>
+              </w:rPr>
+              <w:t xml:space="preserve">Renamed column to movie_cast</w:t>
+            </w:r>
+          </w:p>
+        </w:tc>
+      </w:tr>
+      <w:tr>
+        <w:tc>
+          <w:tcPr>
+            <w:tcW w:type="dxa" w:w="2800"/>
+            <w:tcBorders>
+              <w:top w:val="single" w:color="CCCCCC" w:sz="1"/>
+              <w:left w:val="single" w:color="CCCCCC" w:sz="1"/>
+              <w:bottom w:val="single" w:color="CCCCCC" w:sz="1"/>
+              <w:right w:val="single" w:color="CCCCCC" w:sz="1"/>
+            </w:tcBorders>
+            <w:shd w:fill="FFFFFF" w:val="clear"/>
+            <w:tcMar>
+              <w:top w:type="dxa" w:w="80"/>
+              <w:left w:type="dxa" w:w="120"/>
+              <w:bottom w:type="dxa" w:w="80"/>
+              <w:right w:type="dxa" w:w="120"/>
+            </w:tcMar>
+          </w:tcPr>
+          <w:p>
+            <w:r>
+              <w:rPr>
+                <w:rFonts w:ascii="Arial" w:cs="Arial" w:eastAsia="Arial" w:hAnsi="Arial"/>
+                <w:b w:val="false"/>
+                <w:bCs w:val="false"/>
+                <w:color w:val="000000"/>
+                <w:sz w:val="18"/>
+                <w:szCs w:val="18"/>
+              </w:rPr>
+              <w:t xml:space="preserve">TMDB genre_ids returned integers</w:t>
+            </w:r>
+          </w:p>
+        </w:tc>
+        <w:tc>
+          <w:tcPr>
+            <w:tcW w:type="dxa" w:w="2800"/>
+            <w:tcBorders>
+              <w:top w:val="single" w:color="CCCCCC" w:sz="1"/>
+              <w:left w:val="single" w:color="CCCCCC" w:sz="1"/>
+              <w:bottom w:val="single" w:color="CCCCCC" w:sz="1"/>
+              <w:right w:val="single" w:color="CCCCCC" w:sz="1"/>
+            </w:tcBorders>
+            <w:shd w:fill="FFFFFF" w:val="clear"/>
+            <w:tcMar>
+              <w:top w:type="dxa" w:w="80"/>
+              <w:left w:type="dxa" w:w="120"/>
+              <w:bottom w:type="dxa" w:w="80"/>
+              <w:right w:type="dxa" w:w="120"/>
+            </w:tcMar>
+          </w:tcPr>
+          <w:p>
+            <w:r>
+              <w:rPr>
+                <w:rFonts w:ascii="Arial" w:cs="Arial" w:eastAsia="Arial" w:hAnsi="Arial"/>
+                <w:b w:val="false"/>
+                <w:bCs w:val="false"/>
+                <w:color w:val="000000"/>
+                <w:sz w:val="18"/>
+                <w:szCs w:val="18"/>
+              </w:rPr>
+              <w:t xml:space="preserve">API returns IDs not name strings</w:t>
+            </w:r>
+          </w:p>
+        </w:tc>
+        <w:tc>
+          <w:tcPr>
+            <w:tcW w:type="dxa" w:w="3426"/>
+            <w:tcBorders>
+              <w:top w:val="single" w:color="CCCCCC" w:sz="1"/>
+              <w:left w:val="single" w:color="CCCCCC" w:sz="1"/>
+              <w:bottom w:val="single" w:color="CCCCCC" w:sz="1"/>
+              <w:right w:val="single" w:color="CCCCCC" w:sz="1"/>
+            </w:tcBorders>
+            <w:shd w:fill="FFFFFF" w:val="clear"/>
+            <w:tcMar>
+              <w:top w:type="dxa" w:w="80"/>
+              <w:left w:type="dxa" w:w="120"/>
+              <w:bottom w:type="dxa" w:w="80"/>
+              <w:right w:type="dxa" w:w="120"/>
+            </w:tcMar>
+          </w:tcPr>
+          <w:p>
+            <w:r>
+              <w:rPr>
+                <w:rFonts w:ascii="Arial" w:cs="Arial" w:eastAsia="Arial" w:hAnsi="Arial"/>
+                <w:b w:val="false"/>
+                <w:bCs w:val="false"/>
+                <w:color w:val="000000"/>
+                <w:sz w:val="18"/>
+                <w:szCs w:val="18"/>
+              </w:rPr>
+              <w:t xml:space="preserve">Converted using str(g); full names Week 3</w:t>
+            </w:r>
+          </w:p>
+        </w:tc>
+      </w:tr>
+      <w:tr>
+        <w:tc>
+          <w:tcPr>
+            <w:tcW w:type="dxa" w:w="2800"/>
+            <w:tcBorders>
+              <w:top w:val="single" w:color="CCCCCC" w:sz="1"/>
+              <w:left w:val="single" w:color="CCCCCC" w:sz="1"/>
+              <w:bottom w:val="single" w:color="CCCCCC" w:sz="1"/>
+              <w:right w:val="single" w:color="CCCCCC" w:sz="1"/>
+            </w:tcBorders>
+            <w:shd w:fill="FFFFFF" w:val="clear"/>
+            <w:tcMar>
+              <w:top w:type="dxa" w:w="80"/>
+              <w:left w:type="dxa" w:w="120"/>
+              <w:bottom w:type="dxa" w:w="80"/>
+              <w:right w:type="dxa" w:w="120"/>
+            </w:tcMar>
+          </w:tcPr>
+          <w:p>
+            <w:r>
+              <w:rPr>
+                <w:rFonts w:ascii="Arial" w:cs="Arial" w:eastAsia="Arial" w:hAnsi="Arial"/>
+                <w:b w:val="false"/>
+                <w:bCs w:val="false"/>
+                <w:color w:val="000000"/>
+                <w:sz w:val="18"/>
+                <w:szCs w:val="18"/>
+              </w:rPr>
+              <w:t xml:space="preserve">NLP tests failing — string index error</w:t>
+            </w:r>
+          </w:p>
+        </w:tc>
+        <w:tc>
+          <w:tcPr>
+            <w:tcW w:type="dxa" w:w="2800"/>
+            <w:tcBorders>
+              <w:top w:val="single" w:color="CCCCCC" w:sz="1"/>
+              <w:left w:val="single" w:color="CCCCCC" w:sz="1"/>
+              <w:bottom w:val="single" w:color="CCCCCC" w:sz="1"/>
+              <w:right w:val="single" w:color="CCCCCC" w:sz="1"/>
+            </w:tcBorders>
+            <w:shd w:fill="FFFFFF" w:val="clear"/>
+            <w:tcMar>
+              <w:top w:type="dxa" w:w="80"/>
+              <w:left w:type="dxa" w:w="120"/>
+              <w:bottom w:type="dxa" w:w="80"/>
+              <w:right w:type="dxa" w:w="120"/>
+            </w:tcMar>
+          </w:tcPr>
+          <w:p>
+            <w:r>
+              <w:rPr>
+                <w:rFonts w:ascii="Arial" w:cs="Arial" w:eastAsia="Arial" w:hAnsi="Arial"/>
+                <w:b w:val="false"/>
+                <w:bCs w:val="false"/>
+                <w:color w:val="000000"/>
+                <w:sz w:val="18"/>
+                <w:szCs w:val="18"/>
+              </w:rPr>
+              <w:t xml:space="preserve">Newer transformers API uses top_k not return_all_scores</w:t>
+            </w:r>
+          </w:p>
+        </w:tc>
+        <w:tc>
+          <w:tcPr>
+            <w:tcW w:type="dxa" w:w="3426"/>
+            <w:tcBorders>
+              <w:top w:val="single" w:color="CCCCCC" w:sz="1"/>
+              <w:left w:val="single" w:color="CCCCCC" w:sz="1"/>
+              <w:bottom w:val="single" w:color="CCCCCC" w:sz="1"/>
+              <w:right w:val="single" w:color="CCCCCC" w:sz="1"/>
+            </w:tcBorders>
+            <w:shd w:fill="FFFFFF" w:val="clear"/>
+            <w:tcMar>
+              <w:top w:type="dxa" w:w="80"/>
+              <w:left w:type="dxa" w:w="120"/>
+              <w:bottom w:type="dxa" w:w="80"/>
+              <w:right w:type="dxa" w:w="120"/>
+            </w:tcMar>
+          </w:tcPr>
+          <w:p>
+            <w:r>
+              <w:rPr>
+                <w:rFonts w:ascii="Arial" w:cs="Arial" w:eastAsia="Arial" w:hAnsi="Arial"/>
+                <w:b w:val="false"/>
+                <w:bCs w:val="false"/>
+                <w:color w:val="000000"/>
+                <w:sz w:val="18"/>
+                <w:szCs w:val="18"/>
+              </w:rPr>
+              <w:t xml:space="preserve">Changed to top_k=None; all 8 NLP tests now pass</w:t>
+            </w:r>
+          </w:p>
+        </w:tc>
+      </w:tr>
+    </w:tbl>
+    <w:p>
+      <w:pPr>
+        <w:spacing w:after="80" w:before="80"/>
+      </w:pPr>
+      <w:r>
+        <w:t xml:space="preserve"/>
+      </w:r>
+    </w:p>
+    <w:p>
+      <w:pPr>
+        <w:pBdr>
+          <w:bottom w:val="single" w:color="2E75B6" w:sz="6" w:space="1"/>
+        </w:pBdr>
+        <w:spacing w:after="100" w:before="200"/>
+      </w:pPr>
+      <w:r>
+        <w:rPr>
+          <w:rFonts w:ascii="Arial" w:cs="Arial" w:eastAsia="Arial" w:hAnsi="Arial"/>
+          <w:b/>
+          <w:bCs/>
+          <w:color w:val="1F3864"/>
+          <w:sz w:val="26"/>
+          <w:szCs w:val="26"/>
+        </w:rPr>
+        <w:t xml:space="preserve">8. Week 3 Plan — 29 June to 5 July 2026</w:t>
       </w:r>
     </w:p>
     <w:tbl>
@@ -3704,8 +5914,8 @@
       </w:tblPr>
       <w:tblGrid>
         <w:gridCol w:w="400"/>
-        <w:gridCol w:w="3800"/>
-        <w:gridCol w:w="4826"/>
+        <w:gridCol w:w="3600"/>
+        <w:gridCol w:w="5026"/>
       </w:tblGrid>
       <w:tr>
         <w:tc>
@@ -3744,7 +5954,7 @@
         </w:tc>
         <w:tc>
           <w:tcPr>
-            <w:tcW w:type="dxa" w:w="3800"/>
+            <w:tcW w:type="dxa" w:w="3600"/>
             <w:tcBorders>
               <w:top w:val="single" w:color="CCCCCC" w:sz="1"/>
               <w:left w:val="single" w:color="CCCCCC" w:sz="1"/>
@@ -3778,7 +5988,7 @@
         </w:tc>
         <w:tc>
           <w:tcPr>
-            <w:tcW w:type="dxa" w:w="4826"/>
+            <w:tcW w:type="dxa" w:w="5026"/>
             <w:tcBorders>
               <w:top w:val="single" w:color="CCCCCC" w:sz="1"/>
               <w:left w:val="single" w:color="CCCCCC" w:sz="1"/>
@@ -3845,63 +6055,63 @@
         </w:tc>
         <w:tc>
           <w:tcPr>
-            <w:tcW w:type="dxa" w:w="3800"/>
-            <w:tcBorders>
-              <w:top w:val="single" w:color="CCCCCC" w:sz="1"/>
-              <w:left w:val="single" w:color="CCCCCC" w:sz="1"/>
-              <w:bottom w:val="single" w:color="CCCCCC" w:sz="1"/>
-              <w:right w:val="single" w:color="CCCCCC" w:sz="1"/>
-            </w:tcBorders>
-            <w:shd w:fill="FFFFFF" w:val="clear"/>
-            <w:tcMar>
-              <w:top w:type="dxa" w:w="80"/>
-              <w:left w:type="dxa" w:w="120"/>
-              <w:bottom w:type="dxa" w:w="80"/>
-              <w:right w:type="dxa" w:w="120"/>
-            </w:tcMar>
-          </w:tcPr>
-          <w:p>
-            <w:r>
-              <w:rPr>
-                <w:rFonts w:ascii="Arial" w:cs="Arial" w:eastAsia="Arial" w:hAnsi="Arial"/>
-                <w:b w:val="false"/>
-                <w:bCs w:val="false"/>
-                <w:color w:val="000000"/>
-                <w:sz w:val="18"/>
-                <w:szCs w:val="18"/>
-              </w:rPr>
-              <w:t xml:space="preserve">Load MovieLens data into PostgreSQL</w:t>
-            </w:r>
-          </w:p>
-        </w:tc>
-        <w:tc>
-          <w:tcPr>
-            <w:tcW w:type="dxa" w:w="4826"/>
-            <w:tcBorders>
-              <w:top w:val="single" w:color="CCCCCC" w:sz="1"/>
-              <w:left w:val="single" w:color="CCCCCC" w:sz="1"/>
-              <w:bottom w:val="single" w:color="CCCCCC" w:sz="1"/>
-              <w:right w:val="single" w:color="CCCCCC" w:sz="1"/>
-            </w:tcBorders>
-            <w:shd w:fill="FFFFFF" w:val="clear"/>
-            <w:tcMar>
-              <w:top w:type="dxa" w:w="80"/>
-              <w:left w:type="dxa" w:w="120"/>
-              <w:bottom w:type="dxa" w:w="80"/>
-              <w:right w:type="dxa" w:w="120"/>
-            </w:tcMar>
-          </w:tcPr>
-          <w:p>
-            <w:r>
-              <w:rPr>
-                <w:rFonts w:ascii="Arial" w:cs="Arial" w:eastAsia="Arial" w:hAnsi="Arial"/>
-                <w:b w:val="false"/>
-                <w:bCs w:val="false"/>
-                <w:color w:val="000000"/>
-                <w:sz w:val="18"/>
-                <w:szCs w:val="18"/>
-              </w:rPr>
-              <w:t xml:space="preserve">100K ratings + 1682 movies in database</w:t>
+            <w:tcW w:type="dxa" w:w="3600"/>
+            <w:tcBorders>
+              <w:top w:val="single" w:color="CCCCCC" w:sz="1"/>
+              <w:left w:val="single" w:color="CCCCCC" w:sz="1"/>
+              <w:bottom w:val="single" w:color="CCCCCC" w:sz="1"/>
+              <w:right w:val="single" w:color="CCCCCC" w:sz="1"/>
+            </w:tcBorders>
+            <w:shd w:fill="FFFFFF" w:val="clear"/>
+            <w:tcMar>
+              <w:top w:type="dxa" w:w="80"/>
+              <w:left w:type="dxa" w:w="120"/>
+              <w:bottom w:type="dxa" w:w="80"/>
+              <w:right w:type="dxa" w:w="120"/>
+            </w:tcMar>
+          </w:tcPr>
+          <w:p>
+            <w:r>
+              <w:rPr>
+                <w:rFonts w:ascii="Arial" w:cs="Arial" w:eastAsia="Arial" w:hAnsi="Arial"/>
+                <w:b w:val="false"/>
+                <w:bCs w:val="false"/>
+                <w:color w:val="000000"/>
+                <w:sz w:val="18"/>
+                <w:szCs w:val="18"/>
+              </w:rPr>
+              <w:t xml:space="preserve">Load MovieLens ratings into PostgreSQL</w:t>
+            </w:r>
+          </w:p>
+        </w:tc>
+        <w:tc>
+          <w:tcPr>
+            <w:tcW w:type="dxa" w:w="5026"/>
+            <w:tcBorders>
+              <w:top w:val="single" w:color="CCCCCC" w:sz="1"/>
+              <w:left w:val="single" w:color="CCCCCC" w:sz="1"/>
+              <w:bottom w:val="single" w:color="CCCCCC" w:sz="1"/>
+              <w:right w:val="single" w:color="CCCCCC" w:sz="1"/>
+            </w:tcBorders>
+            <w:shd w:fill="FFFFFF" w:val="clear"/>
+            <w:tcMar>
+              <w:top w:type="dxa" w:w="80"/>
+              <w:left w:type="dxa" w:w="120"/>
+              <w:bottom w:type="dxa" w:w="80"/>
+              <w:right w:type="dxa" w:w="120"/>
+            </w:tcMar>
+          </w:tcPr>
+          <w:p>
+            <w:r>
+              <w:rPr>
+                <w:rFonts w:ascii="Arial" w:cs="Arial" w:eastAsia="Arial" w:hAnsi="Arial"/>
+                <w:b w:val="false"/>
+                <w:bCs w:val="false"/>
+                <w:color w:val="000000"/>
+                <w:sz w:val="18"/>
+                <w:szCs w:val="18"/>
+              </w:rPr>
+              <w:t xml:space="preserve">100,000 ratings in ratings table</w:t>
             </w:r>
           </w:p>
         </w:tc>
@@ -3940,63 +6150,63 @@
         </w:tc>
         <w:tc>
           <w:tcPr>
-            <w:tcW w:type="dxa" w:w="3800"/>
-            <w:tcBorders>
-              <w:top w:val="single" w:color="CCCCCC" w:sz="1"/>
-              <w:left w:val="single" w:color="CCCCCC" w:sz="1"/>
-              <w:bottom w:val="single" w:color="CCCCCC" w:sz="1"/>
-              <w:right w:val="single" w:color="CCCCCC" w:sz="1"/>
-            </w:tcBorders>
-            <w:shd w:fill="FFFFFF" w:val="clear"/>
-            <w:tcMar>
-              <w:top w:type="dxa" w:w="80"/>
-              <w:left w:type="dxa" w:w="120"/>
-              <w:bottom w:type="dxa" w:w="80"/>
-              <w:right w:type="dxa" w:w="120"/>
-            </w:tcMar>
-          </w:tcPr>
-          <w:p>
-            <w:r>
-              <w:rPr>
-                <w:rFonts w:ascii="Arial" w:cs="Arial" w:eastAsia="Arial" w:hAnsi="Arial"/>
-                <w:b w:val="false"/>
-                <w:bCs w:val="false"/>
-                <w:color w:val="000000"/>
-                <w:sz w:val="18"/>
-                <w:szCs w:val="18"/>
-              </w:rPr>
-              <w:t xml:space="preserve">Train Scikit-Surprise SVD model</w:t>
-            </w:r>
-          </w:p>
-        </w:tc>
-        <w:tc>
-          <w:tcPr>
-            <w:tcW w:type="dxa" w:w="4826"/>
-            <w:tcBorders>
-              <w:top w:val="single" w:color="CCCCCC" w:sz="1"/>
-              <w:left w:val="single" w:color="CCCCCC" w:sz="1"/>
-              <w:bottom w:val="single" w:color="CCCCCC" w:sz="1"/>
-              <w:right w:val="single" w:color="CCCCCC" w:sz="1"/>
-            </w:tcBorders>
-            <w:shd w:fill="FFFFFF" w:val="clear"/>
-            <w:tcMar>
-              <w:top w:type="dxa" w:w="80"/>
-              <w:left w:type="dxa" w:w="120"/>
-              <w:bottom w:type="dxa" w:w="80"/>
-              <w:right w:type="dxa" w:w="120"/>
-            </w:tcMar>
-          </w:tcPr>
-          <w:p>
-            <w:r>
-              <w:rPr>
-                <w:rFonts w:ascii="Arial" w:cs="Arial" w:eastAsia="Arial" w:hAnsi="Arial"/>
-                <w:b w:val="false"/>
-                <w:bCs w:val="false"/>
-                <w:color w:val="000000"/>
-                <w:sz w:val="18"/>
-                <w:szCs w:val="18"/>
-              </w:rPr>
-              <w:t xml:space="preserve">Collaborative filtering model saved</w:t>
+            <w:tcW w:type="dxa" w:w="3600"/>
+            <w:tcBorders>
+              <w:top w:val="single" w:color="CCCCCC" w:sz="1"/>
+              <w:left w:val="single" w:color="CCCCCC" w:sz="1"/>
+              <w:bottom w:val="single" w:color="CCCCCC" w:sz="1"/>
+              <w:right w:val="single" w:color="CCCCCC" w:sz="1"/>
+            </w:tcBorders>
+            <w:shd w:fill="FFFFFF" w:val="clear"/>
+            <w:tcMar>
+              <w:top w:type="dxa" w:w="80"/>
+              <w:left w:type="dxa" w:w="120"/>
+              <w:bottom w:type="dxa" w:w="80"/>
+              <w:right w:type="dxa" w:w="120"/>
+            </w:tcMar>
+          </w:tcPr>
+          <w:p>
+            <w:r>
+              <w:rPr>
+                <w:rFonts w:ascii="Arial" w:cs="Arial" w:eastAsia="Arial" w:hAnsi="Arial"/>
+                <w:b w:val="false"/>
+                <w:bCs w:val="false"/>
+                <w:color w:val="000000"/>
+                <w:sz w:val="18"/>
+                <w:szCs w:val="18"/>
+              </w:rPr>
+              <w:t xml:space="preserve">Load enriched movies into PostgreSQL</w:t>
+            </w:r>
+          </w:p>
+        </w:tc>
+        <w:tc>
+          <w:tcPr>
+            <w:tcW w:type="dxa" w:w="5026"/>
+            <w:tcBorders>
+              <w:top w:val="single" w:color="CCCCCC" w:sz="1"/>
+              <w:left w:val="single" w:color="CCCCCC" w:sz="1"/>
+              <w:bottom w:val="single" w:color="CCCCCC" w:sz="1"/>
+              <w:right w:val="single" w:color="CCCCCC" w:sz="1"/>
+            </w:tcBorders>
+            <w:shd w:fill="FFFFFF" w:val="clear"/>
+            <w:tcMar>
+              <w:top w:type="dxa" w:w="80"/>
+              <w:left w:type="dxa" w:w="120"/>
+              <w:bottom w:type="dxa" w:w="80"/>
+              <w:right w:type="dxa" w:w="120"/>
+            </w:tcMar>
+          </w:tcPr>
+          <w:p>
+            <w:r>
+              <w:rPr>
+                <w:rFonts w:ascii="Arial" w:cs="Arial" w:eastAsia="Arial" w:hAnsi="Arial"/>
+                <w:b w:val="false"/>
+                <w:bCs w:val="false"/>
+                <w:color w:val="000000"/>
+                <w:sz w:val="18"/>
+                <w:szCs w:val="18"/>
+              </w:rPr>
+              <w:t xml:space="preserve">1,682 movies in movies table with TMDB data</w:t>
             </w:r>
           </w:p>
         </w:tc>
@@ -4035,63 +6245,63 @@
         </w:tc>
         <w:tc>
           <w:tcPr>
-            <w:tcW w:type="dxa" w:w="3800"/>
-            <w:tcBorders>
-              <w:top w:val="single" w:color="CCCCCC" w:sz="1"/>
-              <w:left w:val="single" w:color="CCCCCC" w:sz="1"/>
-              <w:bottom w:val="single" w:color="CCCCCC" w:sz="1"/>
-              <w:right w:val="single" w:color="CCCCCC" w:sz="1"/>
-            </w:tcBorders>
-            <w:shd w:fill="FFFFFF" w:val="clear"/>
-            <w:tcMar>
-              <w:top w:type="dxa" w:w="80"/>
-              <w:left w:type="dxa" w:w="120"/>
-              <w:bottom w:type="dxa" w:w="80"/>
-              <w:right w:type="dxa" w:w="120"/>
-            </w:tcMar>
-          </w:tcPr>
-          <w:p>
-            <w:r>
-              <w:rPr>
-                <w:rFonts w:ascii="Arial" w:cs="Arial" w:eastAsia="Arial" w:hAnsi="Arial"/>
-                <w:b w:val="false"/>
-                <w:bCs w:val="false"/>
-                <w:color w:val="000000"/>
-                <w:sz w:val="18"/>
-                <w:szCs w:val="18"/>
-              </w:rPr>
-              <w:t xml:space="preserve">Build baseline recommendation engine</w:t>
-            </w:r>
-          </w:p>
-        </w:tc>
-        <w:tc>
-          <w:tcPr>
-            <w:tcW w:type="dxa" w:w="4826"/>
-            <w:tcBorders>
-              <w:top w:val="single" w:color="CCCCCC" w:sz="1"/>
-              <w:left w:val="single" w:color="CCCCCC" w:sz="1"/>
-              <w:bottom w:val="single" w:color="CCCCCC" w:sz="1"/>
-              <w:right w:val="single" w:color="CCCCCC" w:sz="1"/>
-            </w:tcBorders>
-            <w:shd w:fill="FFFFFF" w:val="clear"/>
-            <w:tcMar>
-              <w:top w:type="dxa" w:w="80"/>
-              <w:left w:type="dxa" w:w="120"/>
-              <w:bottom w:type="dxa" w:w="80"/>
-              <w:right w:type="dxa" w:w="120"/>
-            </w:tcMar>
-          </w:tcPr>
-          <w:p>
-            <w:r>
-              <w:rPr>
-                <w:rFonts w:ascii="Arial" w:cs="Arial" w:eastAsia="Arial" w:hAnsi="Arial"/>
-                <w:b w:val="false"/>
-                <w:bCs w:val="false"/>
-                <w:color w:val="000000"/>
-                <w:sz w:val="18"/>
-                <w:szCs w:val="18"/>
-              </w:rPr>
-              <w:t xml:space="preserve">Genre-based recommender working</w:t>
+            <w:tcW w:type="dxa" w:w="3600"/>
+            <w:tcBorders>
+              <w:top w:val="single" w:color="CCCCCC" w:sz="1"/>
+              <w:left w:val="single" w:color="CCCCCC" w:sz="1"/>
+              <w:bottom w:val="single" w:color="CCCCCC" w:sz="1"/>
+              <w:right w:val="single" w:color="CCCCCC" w:sz="1"/>
+            </w:tcBorders>
+            <w:shd w:fill="FFFFFF" w:val="clear"/>
+            <w:tcMar>
+              <w:top w:type="dxa" w:w="80"/>
+              <w:left w:type="dxa" w:w="120"/>
+              <w:bottom w:type="dxa" w:w="80"/>
+              <w:right w:type="dxa" w:w="120"/>
+            </w:tcMar>
+          </w:tcPr>
+          <w:p>
+            <w:r>
+              <w:rPr>
+                <w:rFonts w:ascii="Arial" w:cs="Arial" w:eastAsia="Arial" w:hAnsi="Arial"/>
+                <w:b w:val="false"/>
+                <w:bCs w:val="false"/>
+                <w:color w:val="000000"/>
+                <w:sz w:val="18"/>
+                <w:szCs w:val="18"/>
+              </w:rPr>
+              <w:t xml:space="preserve">Train Scikit-Surprise SVD model</w:t>
+            </w:r>
+          </w:p>
+        </w:tc>
+        <w:tc>
+          <w:tcPr>
+            <w:tcW w:type="dxa" w:w="5026"/>
+            <w:tcBorders>
+              <w:top w:val="single" w:color="CCCCCC" w:sz="1"/>
+              <w:left w:val="single" w:color="CCCCCC" w:sz="1"/>
+              <w:bottom w:val="single" w:color="CCCCCC" w:sz="1"/>
+              <w:right w:val="single" w:color="CCCCCC" w:sz="1"/>
+            </w:tcBorders>
+            <w:shd w:fill="FFFFFF" w:val="clear"/>
+            <w:tcMar>
+              <w:top w:type="dxa" w:w="80"/>
+              <w:left w:type="dxa" w:w="120"/>
+              <w:bottom w:type="dxa" w:w="80"/>
+              <w:right w:type="dxa" w:w="120"/>
+            </w:tcMar>
+          </w:tcPr>
+          <w:p>
+            <w:r>
+              <w:rPr>
+                <w:rFonts w:ascii="Arial" w:cs="Arial" w:eastAsia="Arial" w:hAnsi="Arial"/>
+                <w:b w:val="false"/>
+                <w:bCs w:val="false"/>
+                <w:color w:val="000000"/>
+                <w:sz w:val="18"/>
+                <w:szCs w:val="18"/>
+              </w:rPr>
+              <w:t xml:space="preserve">Collaborative filtering model trained and saved</w:t>
             </w:r>
           </w:p>
         </w:tc>
@@ -4130,63 +6340,63 @@
         </w:tc>
         <w:tc>
           <w:tcPr>
-            <w:tcW w:type="dxa" w:w="3800"/>
-            <w:tcBorders>
-              <w:top w:val="single" w:color="CCCCCC" w:sz="1"/>
-              <w:left w:val="single" w:color="CCCCCC" w:sz="1"/>
-              <w:bottom w:val="single" w:color="CCCCCC" w:sz="1"/>
-              <w:right w:val="single" w:color="CCCCCC" w:sz="1"/>
-            </w:tcBorders>
-            <w:shd w:fill="FFFFFF" w:val="clear"/>
-            <w:tcMar>
-              <w:top w:type="dxa" w:w="80"/>
-              <w:left w:type="dxa" w:w="120"/>
-              <w:bottom w:type="dxa" w:w="80"/>
-              <w:right w:type="dxa" w:w="120"/>
-            </w:tcMar>
-          </w:tcPr>
-          <w:p>
-            <w:r>
-              <w:rPr>
-                <w:rFonts w:ascii="Arial" w:cs="Arial" w:eastAsia="Arial" w:hAnsi="Arial"/>
-                <w:b w:val="false"/>
-                <w:bCs w:val="false"/>
-                <w:color w:val="000000"/>
-                <w:sz w:val="18"/>
-                <w:szCs w:val="18"/>
-              </w:rPr>
-              <w:t xml:space="preserve">NLP recommendation integration</w:t>
-            </w:r>
-          </w:p>
-        </w:tc>
-        <w:tc>
-          <w:tcPr>
-            <w:tcW w:type="dxa" w:w="4826"/>
-            <w:tcBorders>
-              <w:top w:val="single" w:color="CCCCCC" w:sz="1"/>
-              <w:left w:val="single" w:color="CCCCCC" w:sz="1"/>
-              <w:bottom w:val="single" w:color="CCCCCC" w:sz="1"/>
-              <w:right w:val="single" w:color="CCCCCC" w:sz="1"/>
-            </w:tcBorders>
-            <w:shd w:fill="FFFFFF" w:val="clear"/>
-            <w:tcMar>
-              <w:top w:type="dxa" w:w="80"/>
-              <w:left w:type="dxa" w:w="120"/>
-              <w:bottom w:type="dxa" w:w="80"/>
-              <w:right w:type="dxa" w:w="120"/>
-            </w:tcMar>
-          </w:tcPr>
-          <w:p>
-            <w:r>
-              <w:rPr>
-                <w:rFonts w:ascii="Arial" w:cs="Arial" w:eastAsia="Arial" w:hAnsi="Arial"/>
-                <w:b w:val="false"/>
-                <w:bCs w:val="false"/>
-                <w:color w:val="000000"/>
-                <w:sz w:val="18"/>
-                <w:szCs w:val="18"/>
-              </w:rPr>
-              <w:t xml:space="preserve">Emotion → recommendation pipeline</w:t>
+            <w:tcW w:type="dxa" w:w="3600"/>
+            <w:tcBorders>
+              <w:top w:val="single" w:color="CCCCCC" w:sz="1"/>
+              <w:left w:val="single" w:color="CCCCCC" w:sz="1"/>
+              <w:bottom w:val="single" w:color="CCCCCC" w:sz="1"/>
+              <w:right w:val="single" w:color="CCCCCC" w:sz="1"/>
+            </w:tcBorders>
+            <w:shd w:fill="FFFFFF" w:val="clear"/>
+            <w:tcMar>
+              <w:top w:type="dxa" w:w="80"/>
+              <w:left w:type="dxa" w:w="120"/>
+              <w:bottom w:type="dxa" w:w="80"/>
+              <w:right w:type="dxa" w:w="120"/>
+            </w:tcMar>
+          </w:tcPr>
+          <w:p>
+            <w:r>
+              <w:rPr>
+                <w:rFonts w:ascii="Arial" w:cs="Arial" w:eastAsia="Arial" w:hAnsi="Arial"/>
+                <w:b w:val="false"/>
+                <w:bCs w:val="false"/>
+                <w:color w:val="000000"/>
+                <w:sz w:val="18"/>
+                <w:szCs w:val="18"/>
+              </w:rPr>
+              <w:t xml:space="preserve">Build baseline recommendation engine</w:t>
+            </w:r>
+          </w:p>
+        </w:tc>
+        <w:tc>
+          <w:tcPr>
+            <w:tcW w:type="dxa" w:w="5026"/>
+            <w:tcBorders>
+              <w:top w:val="single" w:color="CCCCCC" w:sz="1"/>
+              <w:left w:val="single" w:color="CCCCCC" w:sz="1"/>
+              <w:bottom w:val="single" w:color="CCCCCC" w:sz="1"/>
+              <w:right w:val="single" w:color="CCCCCC" w:sz="1"/>
+            </w:tcBorders>
+            <w:shd w:fill="FFFFFF" w:val="clear"/>
+            <w:tcMar>
+              <w:top w:type="dxa" w:w="80"/>
+              <w:left w:type="dxa" w:w="120"/>
+              <w:bottom w:type="dxa" w:w="80"/>
+              <w:right w:type="dxa" w:w="120"/>
+            </w:tcMar>
+          </w:tcPr>
+          <w:p>
+            <w:r>
+              <w:rPr>
+                <w:rFonts w:ascii="Arial" w:cs="Arial" w:eastAsia="Arial" w:hAnsi="Arial"/>
+                <w:b w:val="false"/>
+                <w:bCs w:val="false"/>
+                <w:color w:val="000000"/>
+                <w:sz w:val="18"/>
+                <w:szCs w:val="18"/>
+              </w:rPr>
+              <w:t xml:space="preserve">Genre-based recommender returning 5 movies</w:t>
             </w:r>
           </w:p>
         </w:tc>
@@ -4225,63 +6435,158 @@
         </w:tc>
         <w:tc>
           <w:tcPr>
-            <w:tcW w:type="dxa" w:w="3800"/>
-            <w:tcBorders>
-              <w:top w:val="single" w:color="CCCCCC" w:sz="1"/>
-              <w:left w:val="single" w:color="CCCCCC" w:sz="1"/>
-              <w:bottom w:val="single" w:color="CCCCCC" w:sz="1"/>
-              <w:right w:val="single" w:color="CCCCCC" w:sz="1"/>
-            </w:tcBorders>
-            <w:shd w:fill="FFFFFF" w:val="clear"/>
-            <w:tcMar>
-              <w:top w:type="dxa" w:w="80"/>
-              <w:left w:type="dxa" w:w="120"/>
-              <w:bottom w:type="dxa" w:w="80"/>
-              <w:right w:type="dxa" w:w="120"/>
-            </w:tcMar>
-          </w:tcPr>
-          <w:p>
-            <w:r>
-              <w:rPr>
-                <w:rFonts w:ascii="Arial" w:cs="Arial" w:eastAsia="Arial" w:hAnsi="Arial"/>
-                <w:b w:val="false"/>
-                <w:bCs w:val="false"/>
-                <w:color w:val="000000"/>
-                <w:sz w:val="18"/>
-                <w:szCs w:val="18"/>
-              </w:rPr>
-              <w:t xml:space="preserve">Start Chapter 1 Introduction draft</w:t>
-            </w:r>
-          </w:p>
-        </w:tc>
-        <w:tc>
-          <w:tcPr>
-            <w:tcW w:type="dxa" w:w="4826"/>
-            <w:tcBorders>
-              <w:top w:val="single" w:color="CCCCCC" w:sz="1"/>
-              <w:left w:val="single" w:color="CCCCCC" w:sz="1"/>
-              <w:bottom w:val="single" w:color="CCCCCC" w:sz="1"/>
-              <w:right w:val="single" w:color="CCCCCC" w:sz="1"/>
-            </w:tcBorders>
-            <w:shd w:fill="FFFFFF" w:val="clear"/>
-            <w:tcMar>
-              <w:top w:type="dxa" w:w="80"/>
-              <w:left w:type="dxa" w:w="120"/>
-              <w:bottom w:type="dxa" w:w="80"/>
-              <w:right w:type="dxa" w:w="120"/>
-            </w:tcMar>
-          </w:tcPr>
-          <w:p>
-            <w:r>
-              <w:rPr>
-                <w:rFonts w:ascii="Arial" w:cs="Arial" w:eastAsia="Arial" w:hAnsi="Arial"/>
-                <w:b w:val="false"/>
-                <w:bCs w:val="false"/>
-                <w:color w:val="000000"/>
-                <w:sz w:val="18"/>
-                <w:szCs w:val="18"/>
-              </w:rPr>
-              <w:t xml:space="preserve">First draft of dissertation introduction</w:t>
+            <w:tcW w:type="dxa" w:w="3600"/>
+            <w:tcBorders>
+              <w:top w:val="single" w:color="CCCCCC" w:sz="1"/>
+              <w:left w:val="single" w:color="CCCCCC" w:sz="1"/>
+              <w:bottom w:val="single" w:color="CCCCCC" w:sz="1"/>
+              <w:right w:val="single" w:color="CCCCCC" w:sz="1"/>
+            </w:tcBorders>
+            <w:shd w:fill="FFFFFF" w:val="clear"/>
+            <w:tcMar>
+              <w:top w:type="dxa" w:w="80"/>
+              <w:left w:type="dxa" w:w="120"/>
+              <w:bottom w:type="dxa" w:w="80"/>
+              <w:right w:type="dxa" w:w="120"/>
+            </w:tcMar>
+          </w:tcPr>
+          <w:p>
+            <w:r>
+              <w:rPr>
+                <w:rFonts w:ascii="Arial" w:cs="Arial" w:eastAsia="Arial" w:hAnsi="Arial"/>
+                <w:b w:val="false"/>
+                <w:bCs w:val="false"/>
+                <w:color w:val="000000"/>
+                <w:sz w:val="18"/>
+                <w:szCs w:val="18"/>
+              </w:rPr>
+              <w:t xml:space="preserve">NLP + recommendation pipeline connect</w:t>
+            </w:r>
+          </w:p>
+        </w:tc>
+        <w:tc>
+          <w:tcPr>
+            <w:tcW w:type="dxa" w:w="5026"/>
+            <w:tcBorders>
+              <w:top w:val="single" w:color="CCCCCC" w:sz="1"/>
+              <w:left w:val="single" w:color="CCCCCC" w:sz="1"/>
+              <w:bottom w:val="single" w:color="CCCCCC" w:sz="1"/>
+              <w:right w:val="single" w:color="CCCCCC" w:sz="1"/>
+            </w:tcBorders>
+            <w:shd w:fill="FFFFFF" w:val="clear"/>
+            <w:tcMar>
+              <w:top w:type="dxa" w:w="80"/>
+              <w:left w:type="dxa" w:w="120"/>
+              <w:bottom w:type="dxa" w:w="80"/>
+              <w:right w:type="dxa" w:w="120"/>
+            </w:tcMar>
+          </w:tcPr>
+          <w:p>
+            <w:r>
+              <w:rPr>
+                <w:rFonts w:ascii="Arial" w:cs="Arial" w:eastAsia="Arial" w:hAnsi="Arial"/>
+                <w:b w:val="false"/>
+                <w:bCs w:val="false"/>
+                <w:color w:val="000000"/>
+                <w:sz w:val="18"/>
+                <w:szCs w:val="18"/>
+              </w:rPr>
+              <w:t xml:space="preserve">Mood text → emotion → movie recommendations</w:t>
+            </w:r>
+          </w:p>
+        </w:tc>
+      </w:tr>
+      <w:tr>
+        <w:tc>
+          <w:tcPr>
+            <w:tcW w:type="dxa" w:w="400"/>
+            <w:tcBorders>
+              <w:top w:val="single" w:color="CCCCCC" w:sz="1"/>
+              <w:left w:val="single" w:color="CCCCCC" w:sz="1"/>
+              <w:bottom w:val="single" w:color="CCCCCC" w:sz="1"/>
+              <w:right w:val="single" w:color="CCCCCC" w:sz="1"/>
+            </w:tcBorders>
+            <w:shd w:fill="F2F2F2" w:val="clear"/>
+            <w:tcMar>
+              <w:top w:type="dxa" w:w="80"/>
+              <w:left w:type="dxa" w:w="120"/>
+              <w:bottom w:type="dxa" w:w="80"/>
+              <w:right w:type="dxa" w:w="120"/>
+            </w:tcMar>
+          </w:tcPr>
+          <w:p>
+            <w:r>
+              <w:rPr>
+                <w:rFonts w:ascii="Arial" w:cs="Arial" w:eastAsia="Arial" w:hAnsi="Arial"/>
+                <w:b/>
+                <w:bCs/>
+                <w:color w:val="000000"/>
+                <w:sz w:val="18"/>
+                <w:szCs w:val="18"/>
+              </w:rPr>
+              <w:t xml:space="preserve">6</w:t>
+            </w:r>
+          </w:p>
+        </w:tc>
+        <w:tc>
+          <w:tcPr>
+            <w:tcW w:type="dxa" w:w="3600"/>
+            <w:tcBorders>
+              <w:top w:val="single" w:color="CCCCCC" w:sz="1"/>
+              <w:left w:val="single" w:color="CCCCCC" w:sz="1"/>
+              <w:bottom w:val="single" w:color="CCCCCC" w:sz="1"/>
+              <w:right w:val="single" w:color="CCCCCC" w:sz="1"/>
+            </w:tcBorders>
+            <w:shd w:fill="FFFFFF" w:val="clear"/>
+            <w:tcMar>
+              <w:top w:type="dxa" w:w="80"/>
+              <w:left w:type="dxa" w:w="120"/>
+              <w:bottom w:type="dxa" w:w="80"/>
+              <w:right w:type="dxa" w:w="120"/>
+            </w:tcMar>
+          </w:tcPr>
+          <w:p>
+            <w:r>
+              <w:rPr>
+                <w:rFonts w:ascii="Arial" w:cs="Arial" w:eastAsia="Arial" w:hAnsi="Arial"/>
+                <w:b w:val="false"/>
+                <w:bCs w:val="false"/>
+                <w:color w:val="000000"/>
+                <w:sz w:val="18"/>
+                <w:szCs w:val="18"/>
+              </w:rPr>
+              <w:t xml:space="preserve">Start Chapter 1 — Introduction draft</w:t>
+            </w:r>
+          </w:p>
+        </w:tc>
+        <w:tc>
+          <w:tcPr>
+            <w:tcW w:type="dxa" w:w="5026"/>
+            <w:tcBorders>
+              <w:top w:val="single" w:color="CCCCCC" w:sz="1"/>
+              <w:left w:val="single" w:color="CCCCCC" w:sz="1"/>
+              <w:bottom w:val="single" w:color="CCCCCC" w:sz="1"/>
+              <w:right w:val="single" w:color="CCCCCC" w:sz="1"/>
+            </w:tcBorders>
+            <w:shd w:fill="FFFFFF" w:val="clear"/>
+            <w:tcMar>
+              <w:top w:type="dxa" w:w="80"/>
+              <w:left w:type="dxa" w:w="120"/>
+              <w:bottom w:type="dxa" w:w="80"/>
+              <w:right w:type="dxa" w:w="120"/>
+            </w:tcMar>
+          </w:tcPr>
+          <w:p>
+            <w:r>
+              <w:rPr>
+                <w:rFonts w:ascii="Arial" w:cs="Arial" w:eastAsia="Arial" w:hAnsi="Arial"/>
+                <w:b w:val="false"/>
+                <w:bCs w:val="false"/>
+                <w:color w:val="000000"/>
+                <w:sz w:val="18"/>
+                <w:szCs w:val="18"/>
+              </w:rPr>
+              <w:t xml:space="preserve">First 500 words of dissertation introduction</w:t>
             </w:r>
           </w:p>
         </w:tc>
@@ -4310,7 +6615,7 @@
           <w:sz w:val="16"/>
           <w:szCs w:val="16"/>
         </w:rPr>
-        <w:t xml:space="preserve">MoodCine  |  Weekly Progress Report — Week 2  |  Muhammad Arslan Khan (24160374)  |  University of Hertfordshire</w:t>
+        <w:t xml:space="preserve">MoodCine  |  Weekly Progress Report — Week 2 (Updated)  |  Muhammad Arslan Khan (24160374)  |  University of Hertfordshire</w:t>
       </w:r>
     </w:p>
     <w:sectPr>
@@ -4505,6 +6810,12 @@
       <w:startOverride w:val="1"/>
     </w:lvlOverride>
   </w:num>
+  <w:num w:numId="2">
+    <w:abstractNumId w:val="2"/>
+    <w:lvlOverride w:ilvl="0">
+      <w:startOverride w:val="1"/>
+    </w:lvlOverride>
+  </w:num>
 </w:numbering>
 </file>
 

</xml_diff>